<commit_message>
Updated to lastest changes
</commit_message>
<xml_diff>
--- a/documentation/InstructionManual.docx
+++ b/documentation/InstructionManual.docx
@@ -22,8 +22,9 @@
           <w:szCs w:val="40"/>
           <w:lang w:val="en-US"/>
         </w:rPr>
-        <w:t>Calendar-ProductType recommendation app (Jonathan SGP &lt;&gt; Ai</w:t>
-      </w:r>
+        <w:t>Calendar-</w:t>
+      </w:r>
+      <w:proofErr w:type="spellStart"/>
       <w:r>
         <w:rPr>
           <w:b/>
@@ -33,8 +34,9 @@
           <w:szCs w:val="40"/>
           <w:lang w:val="en-US"/>
         </w:rPr>
-        <w:t>GENT</w:t>
-      </w:r>
+        <w:t>ProductType</w:t>
+      </w:r>
+      <w:proofErr w:type="spellEnd"/>
       <w:r>
         <w:rPr>
           <w:b/>
@@ -44,8 +46,75 @@
           <w:szCs w:val="40"/>
           <w:lang w:val="en-US"/>
         </w:rPr>
-        <w:t>hix)</w:t>
-      </w:r>
+        <w:t xml:space="preserve"> recommendation app (Jonathan SGP &lt;&gt; </w:t>
+      </w:r>
+      <w:proofErr w:type="spellStart"/>
+      <w:r>
+        <w:rPr>
+          <w:b/>
+          <w:bCs/>
+          <w:color w:val="000000" w:themeColor="text1"/>
+          <w:sz w:val="40"/>
+          <w:szCs w:val="40"/>
+          <w:lang w:val="en-US"/>
+        </w:rPr>
+        <w:t>Ai</w:t>
+      </w:r>
+      <w:r>
+        <w:rPr>
+          <w:b/>
+          <w:bCs/>
+          <w:color w:val="000000" w:themeColor="text1"/>
+          <w:sz w:val="40"/>
+          <w:szCs w:val="40"/>
+          <w:lang w:val="en-US"/>
+        </w:rPr>
+        <w:t>GENT</w:t>
+      </w:r>
+      <w:r>
+        <w:rPr>
+          <w:b/>
+          <w:bCs/>
+          <w:color w:val="000000" w:themeColor="text1"/>
+          <w:sz w:val="40"/>
+          <w:szCs w:val="40"/>
+          <w:lang w:val="en-US"/>
+        </w:rPr>
+        <w:t>hix</w:t>
+      </w:r>
+      <w:proofErr w:type="spellEnd"/>
+      <w:r>
+        <w:rPr>
+          <w:b/>
+          <w:bCs/>
+          <w:color w:val="000000" w:themeColor="text1"/>
+          <w:sz w:val="40"/>
+          <w:szCs w:val="40"/>
+          <w:lang w:val="en-US"/>
+        </w:rPr>
+        <w:t>)</w:t>
+      </w:r>
+      <w:r>
+        <w:rPr>
+          <w:b/>
+          <w:bCs/>
+          <w:color w:val="000000" w:themeColor="text1"/>
+          <w:sz w:val="40"/>
+          <w:szCs w:val="40"/>
+          <w:lang w:val="en-US"/>
+        </w:rPr>
+        <w:t xml:space="preserve"> – Phase 2</w:t>
+      </w:r>
+    </w:p>
+    <w:p>
+      <w:pPr>
+        <w:pStyle w:val="Heading2"/>
+        <w:rPr>
+          <w:b/>
+          <w:bCs/>
+          <w:lang w:val="en-US"/>
+        </w:rPr>
+      </w:pPr>
     </w:p>
     <w:p>
       <w:pPr>
@@ -68,336 +137,808 @@
     </w:p>
     <w:p>
       <w:pPr>
-        <w:pStyle w:val="Heading2"/>
+        <w:spacing w:after="0"/>
+        <w:ind w:left="360"/>
+        <w:rPr>
+          <w:b/>
+          <w:bCs/>
+        </w:rPr>
+      </w:pPr>
+      <w:r>
+        <w:rPr>
+          <w:b/>
+          <w:bCs/>
+        </w:rPr>
+        <w:t>Core Application &amp; Logic</w:t>
+      </w:r>
+    </w:p>
+    <w:p>
+      <w:pPr>
         <w:numPr>
           <w:ilvl w:val="0"/>
-          <w:numId w:val="13"/>
+          <w:numId w:val="18"/>
         </w:numPr>
-        <w:rPr>
-          <w:rFonts w:asciiTheme="minorHAnsi" w:eastAsiaTheme="minorHAnsi" w:hAnsiTheme="minorHAnsi" w:cstheme="minorBidi"/>
-          <w:b/>
-          <w:bCs/>
-          <w:color w:val="auto"/>
-          <w:sz w:val="22"/>
-          <w:szCs w:val="22"/>
-          <w:lang w:val="en-US"/>
-        </w:rPr>
-      </w:pPr>
-      <w:r>
-        <w:rPr>
-          <w:rFonts w:asciiTheme="minorHAnsi" w:eastAsiaTheme="minorHAnsi" w:hAnsiTheme="minorHAnsi" w:cstheme="minorBidi"/>
-          <w:b/>
-          <w:bCs/>
-          <w:color w:val="auto"/>
-          <w:sz w:val="22"/>
-          <w:szCs w:val="22"/>
-          <w:lang w:val="en-US"/>
-        </w:rPr>
-        <w:t>.env</w:t>
-      </w:r>
-    </w:p>
-    <w:p>
-      <w:pPr>
-        <w:pStyle w:val="Heading2"/>
+        <w:tabs>
+          <w:tab w:val="clear" w:pos="720"/>
+          <w:tab w:val="num" w:pos="1080"/>
+        </w:tabs>
+        <w:spacing w:after="0"/>
+        <w:ind w:left="1080"/>
+        <w:rPr>
+          <w:b/>
+          <w:bCs/>
+        </w:rPr>
+      </w:pPr>
+      <w:r>
+        <w:rPr>
+          <w:b/>
+          <w:bCs/>
+        </w:rPr>
+        <w:t xml:space="preserve">.env – </w:t>
+      </w:r>
+      <w:r>
+        <w:t>Environment variables</w:t>
+      </w:r>
+    </w:p>
+    <w:p>
+      <w:pPr>
         <w:numPr>
           <w:ilvl w:val="0"/>
-          <w:numId w:val="13"/>
+          <w:numId w:val="18"/>
         </w:numPr>
-        <w:rPr>
-          <w:rFonts w:asciiTheme="minorHAnsi" w:eastAsiaTheme="minorHAnsi" w:hAnsiTheme="minorHAnsi" w:cstheme="minorBidi"/>
-          <w:b/>
-          <w:bCs/>
-          <w:color w:val="auto"/>
-          <w:sz w:val="22"/>
-          <w:szCs w:val="22"/>
-          <w:lang w:val="en-US"/>
-        </w:rPr>
-      </w:pPr>
-      <w:r>
-        <w:rPr>
-          <w:rFonts w:asciiTheme="minorHAnsi" w:eastAsiaTheme="minorHAnsi" w:hAnsiTheme="minorHAnsi" w:cstheme="minorBidi"/>
-          <w:b/>
-          <w:bCs/>
-          <w:color w:val="auto"/>
-          <w:sz w:val="22"/>
-          <w:szCs w:val="22"/>
-          <w:lang w:val="en-US"/>
-        </w:rPr>
-        <w:t>app.py</w:t>
-      </w:r>
-    </w:p>
-    <w:p>
-      <w:pPr>
-        <w:pStyle w:val="Heading2"/>
+        <w:tabs>
+          <w:tab w:val="clear" w:pos="720"/>
+          <w:tab w:val="num" w:pos="1080"/>
+        </w:tabs>
+        <w:spacing w:after="0"/>
+        <w:ind w:left="1080"/>
+        <w:rPr>
+          <w:b/>
+          <w:bCs/>
+        </w:rPr>
+      </w:pPr>
+      <w:r>
+        <w:rPr>
+          <w:b/>
+          <w:bCs/>
+        </w:rPr>
+        <w:t xml:space="preserve">app.py – </w:t>
+      </w:r>
+      <w:r>
+        <w:t>Main application entry point</w:t>
+      </w:r>
+    </w:p>
+    <w:p>
+      <w:pPr>
         <w:numPr>
           <w:ilvl w:val="0"/>
-          <w:numId w:val="13"/>
+          <w:numId w:val="18"/>
         </w:numPr>
-        <w:rPr>
-          <w:rFonts w:asciiTheme="minorHAnsi" w:eastAsiaTheme="minorHAnsi" w:hAnsiTheme="minorHAnsi" w:cstheme="minorBidi"/>
-          <w:b/>
-          <w:bCs/>
-          <w:color w:val="auto"/>
-          <w:sz w:val="22"/>
-          <w:szCs w:val="22"/>
-          <w:lang w:val="en-US"/>
-        </w:rPr>
-      </w:pPr>
-      <w:r>
-        <w:rPr>
-          <w:rFonts w:asciiTheme="minorHAnsi" w:eastAsiaTheme="minorHAnsi" w:hAnsiTheme="minorHAnsi" w:cstheme="minorBidi"/>
-          <w:b/>
-          <w:bCs/>
-          <w:color w:val="auto"/>
-          <w:sz w:val="22"/>
-          <w:szCs w:val="22"/>
-          <w:lang w:val="en-US"/>
-        </w:rPr>
-        <w:t>data_cleaner.py</w:t>
-      </w:r>
-    </w:p>
-    <w:p>
-      <w:pPr>
-        <w:pStyle w:val="ListParagraph"/>
+        <w:tabs>
+          <w:tab w:val="clear" w:pos="720"/>
+          <w:tab w:val="num" w:pos="1080"/>
+        </w:tabs>
+        <w:spacing w:after="0"/>
+        <w:ind w:left="1080"/>
+        <w:rPr>
+          <w:b/>
+          <w:bCs/>
+        </w:rPr>
+      </w:pPr>
+      <w:r>
+        <w:rPr>
+          <w:b/>
+          <w:bCs/>
+        </w:rPr>
+        <w:t xml:space="preserve">data_cleaner.py – </w:t>
+      </w:r>
+      <w:r>
+        <w:t>Data preprocessing logic</w:t>
+      </w:r>
+    </w:p>
+    <w:p>
+      <w:pPr>
         <w:numPr>
           <w:ilvl w:val="0"/>
-          <w:numId w:val="13"/>
+          <w:numId w:val="18"/>
         </w:numPr>
-        <w:rPr>
-          <w:lang w:val="en-US"/>
-        </w:rPr>
-      </w:pPr>
-      <w:r>
-        <w:rPr>
-          <w:b/>
-          <w:bCs/>
-        </w:rPr>
-        <w:t>rules.py</w:t>
-      </w:r>
-    </w:p>
-    <w:p>
-      <w:pPr>
-        <w:pStyle w:val="ListParagraph"/>
+        <w:tabs>
+          <w:tab w:val="clear" w:pos="720"/>
+          <w:tab w:val="num" w:pos="1080"/>
+        </w:tabs>
+        <w:spacing w:after="0"/>
+        <w:ind w:left="1080"/>
+        <w:rPr>
+          <w:b/>
+          <w:bCs/>
+        </w:rPr>
+      </w:pPr>
+      <w:r>
+        <w:rPr>
+          <w:b/>
+          <w:bCs/>
+        </w:rPr>
+        <w:t xml:space="preserve">rules.py – </w:t>
+      </w:r>
+      <w:r>
+        <w:t>Business rules and logic</w:t>
+      </w:r>
+    </w:p>
+    <w:p>
+      <w:pPr>
         <w:numPr>
           <w:ilvl w:val="0"/>
-          <w:numId w:val="13"/>
+          <w:numId w:val="18"/>
         </w:numPr>
-        <w:rPr>
-          <w:lang w:val="en-US"/>
-        </w:rPr>
-      </w:pPr>
-      <w:r>
-        <w:rPr>
-          <w:b/>
-          <w:bCs/>
-        </w:rPr>
-        <w:t>llm_parser.py</w:t>
-      </w:r>
-    </w:p>
-    <w:p>
-      <w:pPr>
-        <w:pStyle w:val="ListParagraph"/>
+        <w:tabs>
+          <w:tab w:val="clear" w:pos="720"/>
+          <w:tab w:val="num" w:pos="1080"/>
+        </w:tabs>
+        <w:spacing w:after="0"/>
+        <w:ind w:left="1080"/>
+        <w:rPr>
+          <w:b/>
+          <w:bCs/>
+        </w:rPr>
+      </w:pPr>
+      <w:r>
+        <w:rPr>
+          <w:b/>
+          <w:bCs/>
+        </w:rPr>
+        <w:t xml:space="preserve">llm_parser.py – </w:t>
+      </w:r>
+      <w:r>
+        <w:t>Logic for parsing LLM responses</w:t>
+      </w:r>
+    </w:p>
+    <w:p>
+      <w:pPr>
         <w:numPr>
           <w:ilvl w:val="0"/>
-          <w:numId w:val="13"/>
+          <w:numId w:val="18"/>
         </w:numPr>
+        <w:tabs>
+          <w:tab w:val="clear" w:pos="720"/>
+          <w:tab w:val="num" w:pos="1080"/>
+        </w:tabs>
         <w:spacing w:after="0"/>
-        <w:rPr>
-          <w:lang w:val="en-US"/>
-        </w:rPr>
-      </w:pPr>
-      <w:r>
-        <w:rPr>
-          <w:b/>
-          <w:bCs/>
-        </w:rPr>
-        <w:t>client_plan_llm.py</w:t>
-      </w:r>
-    </w:p>
-    <w:p>
-      <w:pPr>
-        <w:pStyle w:val="Heading2"/>
+        <w:ind w:left="1080"/>
+        <w:rPr>
+          <w:b/>
+          <w:bCs/>
+        </w:rPr>
+      </w:pPr>
+      <w:r>
+        <w:rPr>
+          <w:b/>
+          <w:bCs/>
+        </w:rPr>
+        <w:t xml:space="preserve">client_plan_llm.py – </w:t>
+      </w:r>
+      <w:r>
+        <w:t>LLM-driven client planning logic</w:t>
+      </w:r>
+    </w:p>
+    <w:p>
+      <w:pPr>
         <w:numPr>
           <w:ilvl w:val="0"/>
-          <w:numId w:val="13"/>
+          <w:numId w:val="18"/>
         </w:numPr>
-        <w:rPr>
-          <w:rFonts w:asciiTheme="minorHAnsi" w:eastAsiaTheme="minorHAnsi" w:hAnsiTheme="minorHAnsi" w:cstheme="minorBidi"/>
-          <w:b/>
-          <w:bCs/>
-          <w:color w:val="auto"/>
-          <w:sz w:val="22"/>
-          <w:szCs w:val="22"/>
-          <w:lang w:val="en-US"/>
-        </w:rPr>
-      </w:pPr>
-      <w:r>
-        <w:rPr>
-          <w:rFonts w:asciiTheme="minorHAnsi" w:eastAsiaTheme="minorHAnsi" w:hAnsiTheme="minorHAnsi" w:cstheme="minorBidi"/>
-          <w:b/>
-          <w:bCs/>
-          <w:color w:val="auto"/>
-          <w:sz w:val="22"/>
-          <w:szCs w:val="22"/>
-          <w:lang w:val="en-US"/>
-        </w:rPr>
-        <w:t>integrated-timeline.ipynb</w:t>
-      </w:r>
-    </w:p>
-    <w:p>
-      <w:pPr>
-        <w:pStyle w:val="Heading2"/>
+        <w:tabs>
+          <w:tab w:val="clear" w:pos="720"/>
+          <w:tab w:val="num" w:pos="1080"/>
+        </w:tabs>
+        <w:spacing w:after="0"/>
+        <w:ind w:left="1080"/>
+        <w:rPr>
+          <w:b/>
+          <w:bCs/>
+        </w:rPr>
+      </w:pPr>
+      <w:r>
+        <w:rPr>
+          <w:b/>
+          <w:bCs/>
+        </w:rPr>
+        <w:t xml:space="preserve">agent_controller.py – </w:t>
+      </w:r>
+      <w:r>
+        <w:t>Orchestration of various agents</w:t>
+      </w:r>
+    </w:p>
+    <w:p>
+      <w:pPr>
         <w:numPr>
           <w:ilvl w:val="0"/>
-          <w:numId w:val="13"/>
+          <w:numId w:val="18"/>
         </w:numPr>
-        <w:rPr>
-          <w:rFonts w:asciiTheme="minorHAnsi" w:eastAsiaTheme="minorHAnsi" w:hAnsiTheme="minorHAnsi" w:cstheme="minorBidi"/>
-          <w:b/>
-          <w:bCs/>
-          <w:color w:val="auto"/>
-          <w:sz w:val="22"/>
-          <w:szCs w:val="22"/>
-          <w:lang w:val="en-US"/>
-        </w:rPr>
-      </w:pPr>
-      <w:r>
-        <w:rPr>
-          <w:rFonts w:asciiTheme="minorHAnsi" w:eastAsiaTheme="minorHAnsi" w:hAnsiTheme="minorHAnsi" w:cstheme="minorBidi"/>
-          <w:b/>
-          <w:bCs/>
-          <w:color w:val="auto"/>
-          <w:sz w:val="22"/>
-          <w:szCs w:val="22"/>
-          <w:lang w:val="en-US"/>
-        </w:rPr>
-        <w:t>data.xlsx</w:t>
-      </w:r>
-    </w:p>
-    <w:p>
-      <w:pPr>
-        <w:pStyle w:val="Heading2"/>
+        <w:tabs>
+          <w:tab w:val="clear" w:pos="720"/>
+          <w:tab w:val="num" w:pos="1080"/>
+        </w:tabs>
+        <w:spacing w:after="0"/>
+        <w:ind w:left="1080"/>
+        <w:rPr>
+          <w:b/>
+          <w:bCs/>
+        </w:rPr>
+      </w:pPr>
+      <w:r>
+        <w:rPr>
+          <w:b/>
+          <w:bCs/>
+        </w:rPr>
+        <w:t xml:space="preserve">llm_router.py – </w:t>
+      </w:r>
+      <w:r>
+        <w:t>Routing requests to appropriate LLM completion logic</w:t>
+      </w:r>
+    </w:p>
+    <w:p>
+      <w:pPr>
+        <w:spacing w:after="0"/>
+        <w:ind w:left="360"/>
+        <w:rPr>
+          <w:b/>
+          <w:bCs/>
+        </w:rPr>
+      </w:pPr>
+      <w:r>
+        <w:rPr>
+          <w:b/>
+          <w:bCs/>
+        </w:rPr>
+        <w:t>Tools &amp; Modules</w:t>
+      </w:r>
+    </w:p>
+    <w:p>
+      <w:pPr>
         <w:numPr>
           <w:ilvl w:val="0"/>
-          <w:numId w:val="13"/>
+          <w:numId w:val="19"/>
         </w:numPr>
-        <w:rPr>
-          <w:rFonts w:asciiTheme="minorHAnsi" w:eastAsiaTheme="minorHAnsi" w:hAnsiTheme="minorHAnsi" w:cstheme="minorBidi"/>
-          <w:b/>
-          <w:bCs/>
-          <w:color w:val="auto"/>
-          <w:sz w:val="22"/>
-          <w:szCs w:val="22"/>
-          <w:lang w:val="en-US"/>
-        </w:rPr>
-      </w:pPr>
-      <w:r>
-        <w:rPr>
-          <w:rFonts w:asciiTheme="minorHAnsi" w:eastAsiaTheme="minorHAnsi" w:hAnsiTheme="minorHAnsi" w:cstheme="minorBidi"/>
-          <w:b/>
-          <w:bCs/>
-          <w:color w:val="auto"/>
-          <w:sz w:val="22"/>
-          <w:szCs w:val="22"/>
-          <w:lang w:val="en-US"/>
-        </w:rPr>
-        <w:t>requirements.txt</w:t>
-      </w:r>
-    </w:p>
-    <w:p>
-      <w:pPr>
-        <w:pStyle w:val="Heading2"/>
+        <w:tabs>
+          <w:tab w:val="clear" w:pos="720"/>
+          <w:tab w:val="num" w:pos="1080"/>
+        </w:tabs>
+        <w:spacing w:after="0"/>
+        <w:ind w:left="1080"/>
+        <w:rPr>
+          <w:b/>
+          <w:bCs/>
+        </w:rPr>
+      </w:pPr>
+      <w:r>
+        <w:rPr>
+          <w:b/>
+          <w:bCs/>
+        </w:rPr>
+        <w:t xml:space="preserve">calendar_tools.py – </w:t>
+      </w:r>
+      <w:r>
+        <w:t>Calendar integration utilities</w:t>
+      </w:r>
+    </w:p>
+    <w:p>
+      <w:pPr>
         <w:numPr>
           <w:ilvl w:val="0"/>
-          <w:numId w:val="13"/>
+          <w:numId w:val="19"/>
         </w:numPr>
-        <w:rPr>
-          <w:rFonts w:asciiTheme="minorHAnsi" w:eastAsiaTheme="minorHAnsi" w:hAnsiTheme="minorHAnsi" w:cstheme="minorBidi"/>
-          <w:b/>
-          <w:bCs/>
-          <w:color w:val="auto"/>
-          <w:sz w:val="22"/>
-          <w:szCs w:val="22"/>
-          <w:lang w:val="en-US"/>
-        </w:rPr>
-      </w:pPr>
-      <w:r>
-        <w:rPr>
-          <w:rFonts w:asciiTheme="minorHAnsi" w:eastAsiaTheme="minorHAnsi" w:hAnsiTheme="minorHAnsi" w:cstheme="minorBidi"/>
-          <w:b/>
-          <w:bCs/>
-          <w:color w:val="auto"/>
-          <w:sz w:val="22"/>
-          <w:szCs w:val="22"/>
-          <w:lang w:val="en-US"/>
-        </w:rPr>
-        <w:t>jonathan-writing-profile.txt</w:t>
-      </w:r>
-    </w:p>
-    <w:p>
-      <w:pPr>
-        <w:pStyle w:val="Heading2"/>
+        <w:tabs>
+          <w:tab w:val="clear" w:pos="720"/>
+          <w:tab w:val="num" w:pos="1080"/>
+        </w:tabs>
+        <w:spacing w:after="0"/>
+        <w:ind w:left="1080"/>
+        <w:rPr>
+          <w:b/>
+          <w:bCs/>
+        </w:rPr>
+      </w:pPr>
+      <w:r>
+        <w:rPr>
+          <w:b/>
+          <w:bCs/>
+        </w:rPr>
+        <w:t xml:space="preserve">client_tools.py – </w:t>
+      </w:r>
+      <w:r>
+        <w:t>Client-specific data operations</w:t>
+      </w:r>
+    </w:p>
+    <w:p>
+      <w:pPr>
         <w:numPr>
           <w:ilvl w:val="0"/>
-          <w:numId w:val="13"/>
+          <w:numId w:val="19"/>
         </w:numPr>
-        <w:rPr>
-          <w:rFonts w:asciiTheme="minorHAnsi" w:eastAsiaTheme="minorHAnsi" w:hAnsiTheme="minorHAnsi" w:cstheme="minorBidi"/>
-          <w:b/>
-          <w:bCs/>
-          <w:color w:val="auto"/>
-          <w:sz w:val="22"/>
-          <w:szCs w:val="22"/>
-          <w:lang w:val="en-US"/>
-        </w:rPr>
-      </w:pPr>
-      <w:r>
-        <w:rPr>
-          <w:rFonts w:asciiTheme="minorHAnsi" w:eastAsiaTheme="minorHAnsi" w:hAnsiTheme="minorHAnsi" w:cstheme="minorBidi"/>
-          <w:b/>
-          <w:bCs/>
-          <w:color w:val="auto"/>
-          <w:sz w:val="22"/>
-          <w:szCs w:val="22"/>
-          <w:lang w:val="en-US"/>
-        </w:rPr>
-        <w:t>marketoutlook-temporary.txt</w:t>
-      </w:r>
-    </w:p>
-    <w:p>
-      <w:pPr>
-        <w:pStyle w:val="Heading2"/>
+        <w:tabs>
+          <w:tab w:val="clear" w:pos="720"/>
+          <w:tab w:val="num" w:pos="1080"/>
+        </w:tabs>
+        <w:spacing w:after="0"/>
+        <w:ind w:left="1080"/>
+        <w:rPr>
+          <w:b/>
+          <w:bCs/>
+        </w:rPr>
+      </w:pPr>
+      <w:r>
+        <w:rPr>
+          <w:b/>
+          <w:bCs/>
+        </w:rPr>
+        <w:t xml:space="preserve">data_manager.py – </w:t>
+      </w:r>
+      <w:r>
+        <w:t>Management of data flow within the app</w:t>
+      </w:r>
+    </w:p>
+    <w:p>
+      <w:pPr>
         <w:numPr>
           <w:ilvl w:val="0"/>
-          <w:numId w:val="13"/>
+          <w:numId w:val="19"/>
         </w:numPr>
-        <w:rPr>
-          <w:rFonts w:asciiTheme="minorHAnsi" w:eastAsiaTheme="minorHAnsi" w:hAnsiTheme="minorHAnsi" w:cstheme="minorBidi"/>
-          <w:b/>
-          <w:bCs/>
-          <w:color w:val="auto"/>
-          <w:sz w:val="22"/>
-          <w:szCs w:val="22"/>
-          <w:lang w:val="en-US"/>
-        </w:rPr>
-      </w:pPr>
-      <w:r>
-        <w:rPr>
-          <w:rFonts w:asciiTheme="minorHAnsi" w:eastAsiaTheme="minorHAnsi" w:hAnsiTheme="minorHAnsi" w:cstheme="minorBidi"/>
-          <w:b/>
-          <w:bCs/>
-          <w:color w:val="auto"/>
-          <w:sz w:val="22"/>
-          <w:szCs w:val="22"/>
-          <w:lang w:val="en-US"/>
-        </w:rPr>
-        <w:t>writing-style-prompt.txt</w:t>
-      </w:r>
-    </w:p>
-    <w:p>
-      <w:pPr>
-        <w:rPr>
-          <w:lang w:val="en-US"/>
+        <w:tabs>
+          <w:tab w:val="clear" w:pos="720"/>
+          <w:tab w:val="num" w:pos="1080"/>
+        </w:tabs>
+        <w:spacing w:after="0"/>
+        <w:ind w:left="1080"/>
+        <w:rPr>
+          <w:b/>
+          <w:bCs/>
+        </w:rPr>
+      </w:pPr>
+      <w:r>
+        <w:rPr>
+          <w:b/>
+          <w:bCs/>
+        </w:rPr>
+        <w:t xml:space="preserve">email_sender.py – </w:t>
+      </w:r>
+      <w:r>
+        <w:t>Email notification module</w:t>
+      </w:r>
+    </w:p>
+    <w:p>
+      <w:pPr>
+        <w:numPr>
+          <w:ilvl w:val="0"/>
+          <w:numId w:val="19"/>
+        </w:numPr>
+        <w:tabs>
+          <w:tab w:val="clear" w:pos="720"/>
+          <w:tab w:val="num" w:pos="1080"/>
+        </w:tabs>
+        <w:spacing w:after="0"/>
+        <w:ind w:left="1080"/>
+        <w:rPr>
+          <w:b/>
+          <w:bCs/>
+        </w:rPr>
+      </w:pPr>
+      <w:r>
+        <w:rPr>
+          <w:b/>
+          <w:bCs/>
+        </w:rPr>
+        <w:t xml:space="preserve">whatsapp_sender.py – </w:t>
+      </w:r>
+      <w:r>
+        <w:t>WhatsApp Business API integration</w:t>
+      </w:r>
+    </w:p>
+    <w:p>
+      <w:pPr>
+        <w:numPr>
+          <w:ilvl w:val="0"/>
+          <w:numId w:val="19"/>
+        </w:numPr>
+        <w:tabs>
+          <w:tab w:val="clear" w:pos="720"/>
+          <w:tab w:val="num" w:pos="1080"/>
+        </w:tabs>
+        <w:spacing w:after="0"/>
+        <w:ind w:left="1080"/>
+        <w:rPr>
+          <w:b/>
+          <w:bCs/>
+        </w:rPr>
+      </w:pPr>
+      <w:r>
+        <w:rPr>
+          <w:b/>
+          <w:bCs/>
+        </w:rPr>
+        <w:t xml:space="preserve">scheduling_tools.py – </w:t>
+      </w:r>
+      <w:r>
+        <w:t>Task and appointment scheduling logic</w:t>
+      </w:r>
+    </w:p>
+    <w:p>
+      <w:pPr>
+        <w:numPr>
+          <w:ilvl w:val="0"/>
+          <w:numId w:val="19"/>
+        </w:numPr>
+        <w:tabs>
+          <w:tab w:val="clear" w:pos="720"/>
+          <w:tab w:val="num" w:pos="1080"/>
+        </w:tabs>
+        <w:spacing w:after="0"/>
+        <w:ind w:left="1080"/>
+        <w:rPr>
+          <w:b/>
+          <w:bCs/>
+        </w:rPr>
+      </w:pPr>
+      <w:r>
+        <w:rPr>
+          <w:b/>
+          <w:bCs/>
+        </w:rPr>
+        <w:t xml:space="preserve">preview_engine.py – </w:t>
+      </w:r>
+      <w:r>
+        <w:t>Engines for previewing outputs</w:t>
+      </w:r>
+    </w:p>
+    <w:p>
+      <w:pPr>
+        <w:spacing w:after="0"/>
+        <w:ind w:left="360"/>
+        <w:rPr>
+          <w:b/>
+          <w:bCs/>
+        </w:rPr>
+      </w:pPr>
+      <w:r>
+        <w:rPr>
+          <w:b/>
+          <w:bCs/>
+        </w:rPr>
+        <w:t>Data &amp; Documentation</w:t>
+      </w:r>
+    </w:p>
+    <w:p>
+      <w:pPr>
+        <w:numPr>
+          <w:ilvl w:val="0"/>
+          <w:numId w:val="20"/>
+        </w:numPr>
+        <w:tabs>
+          <w:tab w:val="clear" w:pos="720"/>
+          <w:tab w:val="num" w:pos="1080"/>
+        </w:tabs>
+        <w:spacing w:after="0"/>
+        <w:ind w:left="1080"/>
+        <w:rPr>
+          <w:b/>
+          <w:bCs/>
+        </w:rPr>
+      </w:pPr>
+      <w:proofErr w:type="spellStart"/>
+      <w:r>
+        <w:rPr>
+          <w:b/>
+          <w:bCs/>
+        </w:rPr>
+        <w:t>JonathanProj.ipynb</w:t>
+      </w:r>
+      <w:proofErr w:type="spellEnd"/>
+      <w:r>
+        <w:rPr>
+          <w:b/>
+          <w:bCs/>
+        </w:rPr>
+        <w:t xml:space="preserve"> – </w:t>
+      </w:r>
+      <w:r>
+        <w:t xml:space="preserve">Main project notebook </w:t>
+      </w:r>
+    </w:p>
+    <w:p>
+      <w:pPr>
+        <w:numPr>
+          <w:ilvl w:val="0"/>
+          <w:numId w:val="20"/>
+        </w:numPr>
+        <w:tabs>
+          <w:tab w:val="clear" w:pos="720"/>
+          <w:tab w:val="num" w:pos="1080"/>
+        </w:tabs>
+        <w:spacing w:after="0"/>
+        <w:ind w:left="1080"/>
+        <w:rPr>
+          <w:b/>
+          <w:bCs/>
+        </w:rPr>
+      </w:pPr>
+      <w:r>
+        <w:rPr>
+          <w:b/>
+          <w:bCs/>
+        </w:rPr>
+        <w:t xml:space="preserve">data.xlsx – </w:t>
+      </w:r>
+      <w:r>
+        <w:t>Primary input data</w:t>
+      </w:r>
+    </w:p>
+    <w:p>
+      <w:pPr>
+        <w:numPr>
+          <w:ilvl w:val="0"/>
+          <w:numId w:val="20"/>
+        </w:numPr>
+        <w:tabs>
+          <w:tab w:val="clear" w:pos="720"/>
+          <w:tab w:val="num" w:pos="1080"/>
+        </w:tabs>
+        <w:spacing w:after="0"/>
+        <w:ind w:left="1080"/>
+        <w:rPr>
+          <w:b/>
+          <w:bCs/>
+        </w:rPr>
+      </w:pPr>
+      <w:r>
+        <w:rPr>
+          <w:b/>
+          <w:bCs/>
+        </w:rPr>
+        <w:t xml:space="preserve">cleaned_data.xlsx – </w:t>
+      </w:r>
+      <w:proofErr w:type="spellStart"/>
+      <w:r>
+        <w:t>Preprocessed</w:t>
+      </w:r>
+      <w:proofErr w:type="spellEnd"/>
+      <w:r>
+        <w:t xml:space="preserve"> output data</w:t>
+      </w:r>
+    </w:p>
+    <w:p>
+      <w:pPr>
+        <w:numPr>
+          <w:ilvl w:val="0"/>
+          <w:numId w:val="20"/>
+        </w:numPr>
+        <w:tabs>
+          <w:tab w:val="clear" w:pos="720"/>
+          <w:tab w:val="num" w:pos="1080"/>
+        </w:tabs>
+        <w:spacing w:after="0"/>
+        <w:ind w:left="1080"/>
+        <w:rPr>
+          <w:b/>
+          <w:bCs/>
+        </w:rPr>
+      </w:pPr>
+      <w:r>
+        <w:rPr>
+          <w:b/>
+          <w:bCs/>
+        </w:rPr>
+        <w:t xml:space="preserve">reminders.xlsx – </w:t>
+      </w:r>
+      <w:r>
+        <w:t>Stored reminder data</w:t>
+      </w:r>
+    </w:p>
+    <w:p>
+      <w:pPr>
+        <w:numPr>
+          <w:ilvl w:val="0"/>
+          <w:numId w:val="20"/>
+        </w:numPr>
+        <w:tabs>
+          <w:tab w:val="clear" w:pos="720"/>
+          <w:tab w:val="num" w:pos="1080"/>
+        </w:tabs>
+        <w:spacing w:after="0"/>
+        <w:ind w:left="1080"/>
+      </w:pPr>
+      <w:r>
+        <w:rPr>
+          <w:b/>
+          <w:bCs/>
+        </w:rPr>
+        <w:t xml:space="preserve">recommendationOutput.xlsx – </w:t>
+      </w:r>
+      <w:r>
+        <w:t>Generated recommendations</w:t>
+      </w:r>
+    </w:p>
+    <w:p>
+      <w:pPr>
+        <w:numPr>
+          <w:ilvl w:val="0"/>
+          <w:numId w:val="20"/>
+        </w:numPr>
+        <w:tabs>
+          <w:tab w:val="clear" w:pos="720"/>
+          <w:tab w:val="num" w:pos="1080"/>
+        </w:tabs>
+        <w:spacing w:after="0"/>
+        <w:ind w:left="1080"/>
+        <w:rPr>
+          <w:b/>
+          <w:bCs/>
+        </w:rPr>
+      </w:pPr>
+      <w:r>
+        <w:rPr>
+          <w:b/>
+          <w:bCs/>
+        </w:rPr>
+        <w:t xml:space="preserve">jonathan-writing-profile.txt – </w:t>
+      </w:r>
+      <w:r>
+        <w:t>Writing style configuration</w:t>
+      </w:r>
+    </w:p>
+    <w:p>
+      <w:pPr>
+        <w:numPr>
+          <w:ilvl w:val="0"/>
+          <w:numId w:val="20"/>
+        </w:numPr>
+        <w:tabs>
+          <w:tab w:val="clear" w:pos="720"/>
+          <w:tab w:val="num" w:pos="1080"/>
+        </w:tabs>
+        <w:spacing w:after="0"/>
+        <w:ind w:left="1080"/>
+        <w:rPr>
+          <w:b/>
+          <w:bCs/>
+        </w:rPr>
+      </w:pPr>
+      <w:r>
+        <w:rPr>
+          <w:b/>
+          <w:bCs/>
+        </w:rPr>
+        <w:t xml:space="preserve">marketoutlook-temporary.txt – </w:t>
+      </w:r>
+      <w:r>
+        <w:t>Temporary market research data</w:t>
+      </w:r>
+    </w:p>
+    <w:p>
+      <w:pPr>
+        <w:numPr>
+          <w:ilvl w:val="0"/>
+          <w:numId w:val="20"/>
+        </w:numPr>
+        <w:tabs>
+          <w:tab w:val="clear" w:pos="720"/>
+          <w:tab w:val="num" w:pos="1080"/>
+        </w:tabs>
+        <w:spacing w:after="0"/>
+        <w:ind w:left="1080"/>
+        <w:rPr>
+          <w:b/>
+          <w:bCs/>
+        </w:rPr>
+      </w:pPr>
+      <w:r>
+        <w:rPr>
+          <w:b/>
+          <w:bCs/>
+        </w:rPr>
+        <w:t xml:space="preserve">writing-style-prompt.txt – </w:t>
+      </w:r>
+      <w:r>
+        <w:t>Base prompt for writing consistency</w:t>
+      </w:r>
+    </w:p>
+    <w:p>
+      <w:pPr>
+        <w:spacing w:after="0"/>
+        <w:ind w:left="360"/>
+        <w:rPr>
+          <w:b/>
+          <w:bCs/>
+        </w:rPr>
+      </w:pPr>
+      <w:r>
+        <w:rPr>
+          <w:b/>
+          <w:bCs/>
+        </w:rPr>
+        <w:t>Configuration &amp; Dependencies</w:t>
+      </w:r>
+    </w:p>
+    <w:p>
+      <w:pPr>
+        <w:numPr>
+          <w:ilvl w:val="0"/>
+          <w:numId w:val="21"/>
+        </w:numPr>
+        <w:tabs>
+          <w:tab w:val="clear" w:pos="720"/>
+          <w:tab w:val="num" w:pos="1080"/>
+        </w:tabs>
+        <w:spacing w:after="0"/>
+        <w:ind w:left="1080"/>
+        <w:rPr>
+          <w:b/>
+          <w:bCs/>
+        </w:rPr>
+      </w:pPr>
+      <w:r>
+        <w:rPr>
+          <w:b/>
+          <w:bCs/>
+        </w:rPr>
+        <w:t xml:space="preserve">requirements.txt – Python package </w:t>
+      </w:r>
+      <w:proofErr w:type="spellStart"/>
+      <w:r>
+        <w:rPr>
+          <w:b/>
+          <w:bCs/>
+        </w:rPr>
+        <w:t>dependencies</w:t>
+      </w:r>
+      <w:proofErr w:type="spellEnd"/>
+    </w:p>
+    <w:p>
+      <w:pPr>
+        <w:numPr>
+          <w:ilvl w:val="0"/>
+          <w:numId w:val="21"/>
+        </w:numPr>
+        <w:tabs>
+          <w:tab w:val="clear" w:pos="720"/>
+          <w:tab w:val="num" w:pos="1080"/>
+        </w:tabs>
+        <w:spacing w:after="0"/>
+        <w:ind w:left="1080"/>
+        <w:rPr>
+          <w:b/>
+          <w:bCs/>
+        </w:rPr>
+      </w:pPr>
+      <w:r>
+        <w:rPr>
+          <w:b/>
+          <w:bCs/>
+        </w:rPr>
+        <w:t>.</w:t>
+      </w:r>
+      <w:proofErr w:type="spellStart"/>
+      <w:r>
+        <w:rPr>
+          <w:b/>
+          <w:bCs/>
+        </w:rPr>
+        <w:t>env_example</w:t>
+      </w:r>
+      <w:proofErr w:type="spellEnd"/>
+      <w:r>
+        <w:rPr>
+          <w:b/>
+          <w:bCs/>
+        </w:rPr>
+        <w:t> – Template for environment variables</w:t>
+      </w:r>
+    </w:p>
+    <w:p>
+      <w:pPr>
+        <w:spacing w:after="0"/>
+        <w:ind w:left="720"/>
+        <w:rPr>
+          <w:b/>
+          <w:bCs/>
         </w:rPr>
       </w:pPr>
     </w:p>
@@ -453,7 +994,21 @@
         <w:rPr>
           <w:lang w:val="en-US"/>
         </w:rPr>
-        <w:t>VS Code Jupyter extensions</w:t>
+        <w:t xml:space="preserve">VS Code </w:t>
+      </w:r>
+      <w:proofErr w:type="spellStart"/>
+      <w:r>
+        <w:rPr>
+          <w:lang w:val="en-US"/>
+        </w:rPr>
+        <w:t>Jupyter</w:t>
+      </w:r>
+      <w:proofErr w:type="spellEnd"/>
+      <w:r>
+        <w:rPr>
+          <w:lang w:val="en-US"/>
+        </w:rPr>
+        <w:t xml:space="preserve"> extensions</w:t>
       </w:r>
     </w:p>
     <w:p>
@@ -623,6 +1178,7 @@
       </w:pPr>
       <w:r>
         <w:rPr>
+          <w:noProof/>
           <w:lang w:val="en-US"/>
         </w:rPr>
         <w:drawing>
@@ -697,6 +1253,7 @@
       </w:pPr>
       <w:r>
         <w:rPr>
+          <w:noProof/>
           <w:lang w:val="en-US"/>
         </w:rPr>
         <w:drawing>
@@ -763,6 +1320,7 @@
       </w:pPr>
       <w:r>
         <w:rPr>
+          <w:noProof/>
           <w:lang w:val="en-US"/>
         </w:rPr>
         <w:drawing>
@@ -829,6 +1387,7 @@
       </w:pPr>
       <w:r>
         <w:rPr>
+          <w:noProof/>
           <w:lang w:val="en-US"/>
         </w:rPr>
         <w:drawing>
@@ -964,8 +1523,36 @@
           <w:bCs/>
           <w:lang w:val="en-US"/>
         </w:rPr>
-        <w:t>ython -m venv venv</w:t>
-      </w:r>
+        <w:t xml:space="preserve">ython -m </w:t>
+      </w:r>
+      <w:proofErr w:type="spellStart"/>
+      <w:r>
+        <w:rPr>
+          <w:b/>
+          <w:bCs/>
+          <w:lang w:val="en-US"/>
+        </w:rPr>
+        <w:t>venv</w:t>
+      </w:r>
+      <w:proofErr w:type="spellEnd"/>
+      <w:r>
+        <w:rPr>
+          <w:b/>
+          <w:bCs/>
+          <w:lang w:val="en-US"/>
+        </w:rPr>
+        <w:t xml:space="preserve"> </w:t>
+      </w:r>
+      <w:proofErr w:type="spellStart"/>
+      <w:r>
+        <w:rPr>
+          <w:b/>
+          <w:bCs/>
+          <w:lang w:val="en-US"/>
+        </w:rPr>
+        <w:t>venv</w:t>
+      </w:r>
+      <w:proofErr w:type="spellEnd"/>
     </w:p>
     <w:p>
       <w:pPr>
@@ -977,6 +1564,7 @@
       </w:pPr>
       <w:r>
         <w:rPr>
+          <w:noProof/>
           <w:lang w:val="en-US"/>
         </w:rPr>
         <w:drawing>
@@ -1075,7 +1663,43 @@
           <w:bCs/>
           <w:lang w:val="en-US"/>
         </w:rPr>
-        <w:t xml:space="preserve"> create a virtual environment as long as a folder named ‘venv’ exists in your project folder. But, everytime you run the code, you need to always activate the virtual environment</w:t>
+        <w:t xml:space="preserve"> create a virtual environment as long as a folder named ‘</w:t>
+      </w:r>
+      <w:proofErr w:type="spellStart"/>
+      <w:r>
+        <w:rPr>
+          <w:b/>
+          <w:bCs/>
+          <w:lang w:val="en-US"/>
+        </w:rPr>
+        <w:t>venv</w:t>
+      </w:r>
+      <w:proofErr w:type="spellEnd"/>
+      <w:r>
+        <w:rPr>
+          <w:b/>
+          <w:bCs/>
+          <w:lang w:val="en-US"/>
+        </w:rPr>
+        <w:t xml:space="preserve">’ exists in your project folder. But, </w:t>
+      </w:r>
+      <w:proofErr w:type="spellStart"/>
+      <w:r>
+        <w:rPr>
+          <w:b/>
+          <w:bCs/>
+          <w:lang w:val="en-US"/>
+        </w:rPr>
+        <w:t>everytime</w:t>
+      </w:r>
+      <w:proofErr w:type="spellEnd"/>
+      <w:r>
+        <w:rPr>
+          <w:b/>
+          <w:bCs/>
+          <w:lang w:val="en-US"/>
+        </w:rPr>
+        <w:t xml:space="preserve"> you run the code, you need to always activate the virtual environment</w:t>
       </w:r>
       <w:r>
         <w:rPr>
@@ -1117,13 +1741,23 @@
           <w:lang w:val="en-US"/>
         </w:rPr>
       </w:pPr>
-      <w:r>
-        <w:rPr>
-          <w:b/>
-          <w:bCs/>
-          <w:lang w:val="en-US"/>
-        </w:rPr>
-        <w:t>venv/Scripts/activate</w:t>
+      <w:proofErr w:type="spellStart"/>
+      <w:r>
+        <w:rPr>
+          <w:b/>
+          <w:bCs/>
+          <w:lang w:val="en-US"/>
+        </w:rPr>
+        <w:t>venv</w:t>
+      </w:r>
+      <w:proofErr w:type="spellEnd"/>
+      <w:r>
+        <w:rPr>
+          <w:b/>
+          <w:bCs/>
+          <w:lang w:val="en-US"/>
+        </w:rPr>
+        <w:t>/Scripts/activate</w:t>
       </w:r>
     </w:p>
     <w:p>
@@ -1135,6 +1769,7 @@
       </w:pPr>
       <w:r>
         <w:rPr>
+          <w:noProof/>
           <w:lang w:val="en-US"/>
         </w:rPr>
         <w:drawing>
@@ -1229,7 +1864,25 @@
           <w:bCs/>
           <w:lang w:val="en-US"/>
         </w:rPr>
-        <w:t xml:space="preserve">NOTE: You do not always have to install dependencies, as long as you have done it once in your venv its fine. </w:t>
+        <w:t xml:space="preserve">NOTE: You do not always have to install dependencies, as long as you have done it once in your </w:t>
+      </w:r>
+      <w:proofErr w:type="spellStart"/>
+      <w:r>
+        <w:rPr>
+          <w:b/>
+          <w:bCs/>
+          <w:lang w:val="en-US"/>
+        </w:rPr>
+        <w:t>venv</w:t>
+      </w:r>
+      <w:proofErr w:type="spellEnd"/>
+      <w:r>
+        <w:rPr>
+          <w:b/>
+          <w:bCs/>
+          <w:lang w:val="en-US"/>
+        </w:rPr>
+        <w:t xml:space="preserve"> its fine. </w:t>
       </w:r>
     </w:p>
     <w:p>
@@ -1248,7 +1901,23 @@
           <w:color w:val="C00000"/>
           <w:lang w:val="en-US"/>
         </w:rPr>
-        <w:t>Activate Virtual Environment (venv/Scripts/activate)</w:t>
+        <w:t>Activate Virtual Environment (</w:t>
+      </w:r>
+      <w:proofErr w:type="spellStart"/>
+      <w:r>
+        <w:rPr>
+          <w:color w:val="C00000"/>
+          <w:lang w:val="en-US"/>
+        </w:rPr>
+        <w:t>venv</w:t>
+      </w:r>
+      <w:proofErr w:type="spellEnd"/>
+      <w:r>
+        <w:rPr>
+          <w:color w:val="C00000"/>
+          <w:lang w:val="en-US"/>
+        </w:rPr>
+        <w:t>/Scripts/activate)</w:t>
       </w:r>
     </w:p>
     <w:p>
@@ -1308,6 +1977,7 @@
         <w:rPr>
           <w:b/>
           <w:bCs/>
+          <w:noProof/>
           <w:color w:val="C00000"/>
           <w:sz w:val="28"/>
           <w:szCs w:val="28"/>
@@ -1374,13 +2044,7 @@
         <w:rPr>
           <w:lang w:val="en-US"/>
         </w:rPr>
-        <w:t xml:space="preserve"> </w:t>
-      </w:r>
-      <w:r>
-        <w:rPr>
-          <w:lang w:val="en-US"/>
-        </w:rPr>
-        <w:t>Setup .env file</w:t>
+        <w:t xml:space="preserve"> Setup .env file</w:t>
       </w:r>
     </w:p>
     <w:p>
@@ -1433,10 +2097,10 @@
           <w:lang w:val="en-US"/>
         </w:rPr>
         <w:drawing>
-          <wp:inline distT="0" distB="0" distL="0" distR="0" wp14:anchorId="765BD3E5" wp14:editId="3BDCFEB0">
-            <wp:extent cx="3791479" cy="924054"/>
-            <wp:effectExtent l="0" t="0" r="0" b="9525"/>
-            <wp:docPr id="18" name="Picture 18"/>
+          <wp:inline distT="0" distB="0" distL="0" distR="0" wp14:anchorId="1ED683ED" wp14:editId="268FCC2D">
+            <wp:extent cx="5572903" cy="1971950"/>
+            <wp:effectExtent l="0" t="0" r="8890" b="9525"/>
+            <wp:docPr id="8" name="Picture 8"/>
             <wp:cNvGraphicFramePr>
               <a:graphicFrameLocks xmlns:a="http://schemas.openxmlformats.org/drawingml/2006/main" noChangeAspect="1"/>
             </wp:cNvGraphicFramePr>
@@ -1456,7 +2120,7 @@
                   <pic:spPr>
                     <a:xfrm>
                       <a:off x="0" y="0"/>
-                      <a:ext cx="3791479" cy="924054"/>
+                      <a:ext cx="5572903" cy="1971950"/>
                     </a:xfrm>
                     <a:prstGeom prst="rect">
                       <a:avLst/>
@@ -1504,7 +2168,7 @@
           <w:color w:val="000000" w:themeColor="text1"/>
           <w:lang w:val="en-US"/>
         </w:rPr>
-        <w:t>Save the file (ctrl + S)</w:t>
+        <w:t>In line 4, enter your Email address from which you want the mails to be sent.</w:t>
       </w:r>
     </w:p>
     <w:p>
@@ -1523,204 +2187,118 @@
           <w:color w:val="000000" w:themeColor="text1"/>
           <w:lang w:val="en-US"/>
         </w:rPr>
-        <w:t>End Result:</w:t>
-      </w:r>
-    </w:p>
-    <w:p>
-      <w:pPr>
-        <w:ind w:left="720"/>
-        <w:jc w:val="center"/>
-        <w:rPr>
-          <w:b/>
-          <w:bCs/>
-          <w:color w:val="C00000"/>
-          <w:sz w:val="28"/>
-          <w:szCs w:val="28"/>
-          <w:lang w:val="en-US"/>
-        </w:rPr>
-      </w:pPr>
-      <w:r>
-        <w:rPr>
-          <w:b/>
-          <w:bCs/>
-          <w:color w:val="C00000"/>
-          <w:sz w:val="28"/>
-          <w:szCs w:val="28"/>
-          <w:lang w:val="en-US"/>
-        </w:rPr>
-        <w:drawing>
-          <wp:inline distT="0" distB="0" distL="0" distR="0" wp14:anchorId="209441FB" wp14:editId="634187BF">
-            <wp:extent cx="5731510" cy="746760"/>
-            <wp:effectExtent l="0" t="0" r="2540" b="0"/>
-            <wp:docPr id="17" name="Picture 17"/>
-            <wp:cNvGraphicFramePr>
-              <a:graphicFrameLocks xmlns:a="http://schemas.openxmlformats.org/drawingml/2006/main" noChangeAspect="1"/>
-            </wp:cNvGraphicFramePr>
-            <a:graphic xmlns:a="http://schemas.openxmlformats.org/drawingml/2006/main">
-              <a:graphicData uri="http://schemas.openxmlformats.org/drawingml/2006/picture">
-                <pic:pic xmlns:pic="http://schemas.openxmlformats.org/drawingml/2006/picture">
-                  <pic:nvPicPr>
-                    <pic:cNvPr id="1" name=""/>
-                    <pic:cNvPicPr/>
-                  </pic:nvPicPr>
-                  <pic:blipFill rotWithShape="1">
-                    <a:blip r:embed="rId15"/>
-                    <a:srcRect b="22835"/>
-                    <a:stretch/>
-                  </pic:blipFill>
-                  <pic:spPr bwMode="auto">
-                    <a:xfrm>
-                      <a:off x="0" y="0"/>
-                      <a:ext cx="5731510" cy="746760"/>
-                    </a:xfrm>
-                    <a:prstGeom prst="rect">
-                      <a:avLst/>
-                    </a:prstGeom>
-                    <a:ln>
-                      <a:noFill/>
-                    </a:ln>
-                    <a:extLst>
-                      <a:ext uri="{53640926-AAD7-44D8-BBD7-CCE9431645EC}">
-                        <a14:shadowObscured xmlns:a14="http://schemas.microsoft.com/office/drawing/2010/main"/>
-                      </a:ext>
-                    </a:extLst>
-                  </pic:spPr>
-                </pic:pic>
-              </a:graphicData>
-            </a:graphic>
-          </wp:inline>
-        </w:drawing>
+        <w:t xml:space="preserve">In line 5, you must enter your Gmail app password, this is different from the actual password for your </w:t>
+      </w:r>
+      <w:proofErr w:type="spellStart"/>
+      <w:r>
+        <w:rPr>
+          <w:color w:val="000000" w:themeColor="text1"/>
+          <w:lang w:val="en-US"/>
+        </w:rPr>
+        <w:t>gmail</w:t>
+      </w:r>
+      <w:proofErr w:type="spellEnd"/>
+      <w:r>
+        <w:rPr>
+          <w:color w:val="000000" w:themeColor="text1"/>
+          <w:lang w:val="en-US"/>
+        </w:rPr>
+        <w:t xml:space="preserve"> account. This can only be gotten after activating 2 Step verification on your </w:t>
+      </w:r>
+      <w:proofErr w:type="spellStart"/>
+      <w:r>
+        <w:rPr>
+          <w:color w:val="000000" w:themeColor="text1"/>
+          <w:lang w:val="en-US"/>
+        </w:rPr>
+        <w:t>gmail</w:t>
+      </w:r>
+      <w:proofErr w:type="spellEnd"/>
+      <w:r>
+        <w:rPr>
+          <w:color w:val="000000" w:themeColor="text1"/>
+          <w:lang w:val="en-US"/>
+        </w:rPr>
+        <w:t xml:space="preserve"> Id</w:t>
+      </w:r>
+      <w:r>
+        <w:rPr>
+          <w:color w:val="000000" w:themeColor="text1"/>
+          <w:lang w:val="en-US"/>
+        </w:rPr>
+        <w:t>.</w:t>
       </w:r>
     </w:p>
     <w:p>
       <w:pPr>
         <w:pStyle w:val="ListParagraph"/>
         <w:numPr>
-          <w:ilvl w:val="0"/>
-          <w:numId w:val="6"/>
+          <w:ilvl w:val="1"/>
+          <w:numId w:val="17"/>
         </w:numPr>
-        <w:jc w:val="center"/>
-        <w:rPr>
-          <w:b/>
-          <w:bCs/>
-          <w:color w:val="C00000"/>
-          <w:sz w:val="28"/>
-          <w:szCs w:val="28"/>
-          <w:lang w:val="en-US"/>
-        </w:rPr>
-      </w:pPr>
-      <w:r>
-        <w:rPr>
-          <w:b/>
-          <w:bCs/>
-          <w:color w:val="C00000"/>
-          <w:sz w:val="28"/>
-          <w:szCs w:val="28"/>
-          <w:lang w:val="en-US"/>
-        </w:rPr>
-        <w:t>Your Setup is completed, Now, you don’t need to do anything except step (2) every</w:t>
-      </w:r>
-      <w:r>
-        <w:rPr>
-          <w:b/>
-          <w:bCs/>
-          <w:color w:val="C00000"/>
-          <w:sz w:val="28"/>
-          <w:szCs w:val="28"/>
-          <w:lang w:val="en-US"/>
-        </w:rPr>
-        <w:t xml:space="preserve"> </w:t>
-      </w:r>
-      <w:r>
-        <w:rPr>
-          <w:b/>
-          <w:bCs/>
-          <w:color w:val="C00000"/>
-          <w:sz w:val="28"/>
-          <w:szCs w:val="28"/>
-          <w:lang w:val="en-US"/>
-        </w:rPr>
-        <w:t>time you want to run the code</w:t>
+        <w:rPr>
+          <w:lang w:val="en-US"/>
+        </w:rPr>
+      </w:pPr>
+      <w:r>
+        <w:rPr>
+          <w:color w:val="000000" w:themeColor="text1"/>
+          <w:lang w:val="en-US"/>
+        </w:rPr>
+        <w:t xml:space="preserve">First activate 2 step verification on your </w:t>
+      </w:r>
+      <w:proofErr w:type="spellStart"/>
+      <w:r>
+        <w:rPr>
+          <w:color w:val="000000" w:themeColor="text1"/>
+          <w:lang w:val="en-US"/>
+        </w:rPr>
+        <w:t>gmail</w:t>
+      </w:r>
+      <w:proofErr w:type="spellEnd"/>
+      <w:r>
+        <w:rPr>
+          <w:color w:val="000000" w:themeColor="text1"/>
+          <w:lang w:val="en-US"/>
+        </w:rPr>
+        <w:t xml:space="preserve"> account</w:t>
       </w:r>
     </w:p>
     <w:p>
       <w:pPr>
         <w:pStyle w:val="ListParagraph"/>
         <w:numPr>
-          <w:ilvl w:val="0"/>
-          <w:numId w:val="6"/>
+          <w:ilvl w:val="1"/>
+          <w:numId w:val="17"/>
         </w:numPr>
+        <w:rPr>
+          <w:lang w:val="en-US"/>
+        </w:rPr>
+      </w:pPr>
+      <w:r>
+        <w:rPr>
+          <w:color w:val="000000" w:themeColor="text1"/>
+          <w:lang w:val="en-US"/>
+        </w:rPr>
+        <w:t>Then, go to app passwords page:</w:t>
+      </w:r>
+    </w:p>
+    <w:p>
+      <w:pPr>
         <w:jc w:val="center"/>
         <w:rPr>
-          <w:b/>
-          <w:bCs/>
-          <w:color w:val="C00000"/>
-          <w:sz w:val="28"/>
-          <w:szCs w:val="28"/>
-          <w:lang w:val="en-US"/>
-        </w:rPr>
-      </w:pPr>
-      <w:r>
-        <w:rPr>
-          <w:b/>
-          <w:bCs/>
-          <w:color w:val="C00000"/>
-          <w:sz w:val="28"/>
-          <w:szCs w:val="28"/>
-          <w:lang w:val="en-US"/>
-        </w:rPr>
-        <w:t xml:space="preserve">The Indicator for an Active Virtual Environment is </w:t>
-      </w:r>
-      <w:r>
-        <w:rPr>
-          <w:b/>
-          <w:bCs/>
-          <w:color w:val="00B050"/>
-          <w:sz w:val="28"/>
-          <w:szCs w:val="28"/>
-          <w:lang w:val="en-US"/>
-        </w:rPr>
-        <w:t xml:space="preserve">(venv) </w:t>
-      </w:r>
-      <w:r>
-        <w:rPr>
-          <w:b/>
-          <w:bCs/>
-          <w:color w:val="C00000"/>
-          <w:sz w:val="28"/>
-          <w:szCs w:val="28"/>
-          <w:lang w:val="en-US"/>
-        </w:rPr>
-        <w:t>in your command terminal</w:t>
-      </w:r>
-    </w:p>
-    <w:p>
-      <w:pPr>
-        <w:ind w:left="360"/>
-        <w:jc w:val="center"/>
-        <w:rPr>
-          <w:b/>
-          <w:bCs/>
-          <w:color w:val="C00000"/>
-          <w:sz w:val="28"/>
-          <w:szCs w:val="28"/>
-          <w:lang w:val="en-US"/>
-        </w:rPr>
-      </w:pPr>
-      <w:r>
-        <w:rPr>
-          <w:b/>
-          <w:bCs/>
-          <w:color w:val="C00000"/>
-          <w:sz w:val="28"/>
-          <w:szCs w:val="28"/>
+          <w:lang w:val="en-US"/>
+        </w:rPr>
+      </w:pPr>
+      <w:r>
+        <w:rPr>
           <w:lang w:val="en-US"/>
         </w:rPr>
         <w:drawing>
-          <wp:inline distT="0" distB="0" distL="0" distR="0" wp14:anchorId="64E33E7F" wp14:editId="31BB81C1">
-            <wp:extent cx="5731510" cy="263525"/>
-            <wp:effectExtent l="0" t="0" r="2540" b="3175"/>
-            <wp:docPr id="19" name="Picture 19"/>
+          <wp:inline distT="0" distB="0" distL="0" distR="0" wp14:anchorId="66B8B56C" wp14:editId="0D464A1B">
+            <wp:extent cx="5731510" cy="1291590"/>
+            <wp:effectExtent l="0" t="0" r="2540" b="3810"/>
+            <wp:docPr id="9" name="Picture 9"/>
             <wp:cNvGraphicFramePr>
               <a:graphicFrameLocks xmlns:a="http://schemas.openxmlformats.org/drawingml/2006/main" noChangeAspect="1"/>
             </wp:cNvGraphicFramePr>
@@ -1732,7 +2310,7 @@
                     <pic:cNvPicPr/>
                   </pic:nvPicPr>
                   <pic:blipFill>
-                    <a:blip r:embed="rId16"/>
+                    <a:blip r:embed="rId15"/>
                     <a:stretch>
                       <a:fillRect/>
                     </a:stretch>
@@ -1740,7 +2318,7 @@
                   <pic:spPr>
                     <a:xfrm>
                       <a:off x="0" y="0"/>
-                      <a:ext cx="5731510" cy="263525"/>
+                      <a:ext cx="5731510" cy="1291590"/>
                     </a:xfrm>
                     <a:prstGeom prst="rect">
                       <a:avLst/>
@@ -1755,82 +2333,10 @@
     </w:p>
     <w:p>
       <w:pPr>
-        <w:rPr>
-          <w:b/>
-          <w:bCs/>
-          <w:color w:val="C00000"/>
-          <w:sz w:val="28"/>
-          <w:szCs w:val="28"/>
-          <w:lang w:val="en-US"/>
-        </w:rPr>
-      </w:pPr>
-      <w:r>
-        <w:rPr>
-          <w:b/>
-          <w:bCs/>
-          <w:color w:val="C00000"/>
-          <w:sz w:val="28"/>
-          <w:szCs w:val="28"/>
-          <w:lang w:val="en-US"/>
-        </w:rPr>
-        <w:br w:type="page"/>
-      </w:r>
-    </w:p>
-    <w:p>
-      <w:pPr>
-        <w:pStyle w:val="Heading2"/>
-        <w:rPr>
-          <w:b/>
-          <w:bCs/>
-          <w:sz w:val="40"/>
-          <w:szCs w:val="40"/>
-          <w:lang w:val="en-US"/>
-        </w:rPr>
-      </w:pPr>
-      <w:r>
-        <w:rPr>
-          <w:b/>
-          <w:bCs/>
-          <w:sz w:val="40"/>
-          <w:szCs w:val="40"/>
-          <w:lang w:val="en-US"/>
-        </w:rPr>
-        <w:lastRenderedPageBreak/>
-        <w:t>Running the code and application</w:t>
-      </w:r>
-    </w:p>
-    <w:p>
-      <w:pPr>
-        <w:pStyle w:val="Heading2"/>
-        <w:rPr>
-          <w:lang w:val="en-US"/>
-        </w:rPr>
-      </w:pPr>
-      <w:r>
-        <w:rPr>
-          <w:lang w:val="en-US"/>
-        </w:rPr>
-        <w:t>1</w:t>
-      </w:r>
-      <w:r>
-        <w:rPr>
-          <w:lang w:val="en-US"/>
-        </w:rPr>
-        <w:t xml:space="preserve">.  How to </w:t>
-      </w:r>
-      <w:r>
-        <w:rPr>
-          <w:lang w:val="en-US"/>
-        </w:rPr>
-        <w:t>clean data</w:t>
-      </w:r>
-    </w:p>
-    <w:p>
-      <w:pPr>
         <w:pStyle w:val="ListParagraph"/>
         <w:numPr>
-          <w:ilvl w:val="0"/>
-          <w:numId w:val="14"/>
+          <w:ilvl w:val="1"/>
+          <w:numId w:val="17"/>
         </w:numPr>
         <w:rPr>
           <w:lang w:val="en-US"/>
@@ -1840,164 +2346,19 @@
         <w:rPr>
           <w:lang w:val="en-US"/>
         </w:rPr>
-        <w:t xml:space="preserve">First, make sure that </w:t>
-      </w:r>
-      <w:r>
-        <w:rPr>
-          <w:b/>
-          <w:bCs/>
-          <w:lang w:val="en-US"/>
-        </w:rPr>
-        <w:t>‘’data.xlsx”</w:t>
-      </w:r>
-      <w:r>
-        <w:rPr>
-          <w:lang w:val="en-US"/>
-        </w:rPr>
-        <w:t xml:space="preserve"> is the name of the file in which you have the raw data</w:t>
-      </w:r>
-    </w:p>
-    <w:p>
-      <w:pPr>
-        <w:pStyle w:val="ListParagraph"/>
-        <w:numPr>
-          <w:ilvl w:val="0"/>
-          <w:numId w:val="14"/>
-        </w:numPr>
-        <w:rPr>
-          <w:lang w:val="en-US"/>
-        </w:rPr>
-      </w:pPr>
-      <w:r>
-        <w:rPr>
-          <w:lang w:val="en-US"/>
-        </w:rPr>
-        <w:t>Paste that file inside the project folder</w:t>
-      </w:r>
-    </w:p>
-    <w:p>
-      <w:pPr>
-        <w:pStyle w:val="ListParagraph"/>
-        <w:numPr>
-          <w:ilvl w:val="0"/>
-          <w:numId w:val="14"/>
-        </w:numPr>
-        <w:rPr>
-          <w:color w:val="C00000"/>
-          <w:lang w:val="en-US"/>
-        </w:rPr>
-      </w:pPr>
-      <w:r>
-        <w:rPr>
-          <w:color w:val="C00000"/>
-          <w:lang w:val="en-US"/>
-        </w:rPr>
-        <w:t xml:space="preserve">Activate Virtual Environment if you haven’t </w:t>
-      </w:r>
-      <w:r>
-        <w:rPr>
-          <w:color w:val="C00000"/>
-          <w:lang w:val="en-US"/>
-        </w:rPr>
-        <w:t>(venv/Scripts/activate)</w:t>
-      </w:r>
-    </w:p>
-    <w:p>
-      <w:pPr>
-        <w:pStyle w:val="ListParagraph"/>
-        <w:numPr>
-          <w:ilvl w:val="0"/>
-          <w:numId w:val="14"/>
-        </w:numPr>
-        <w:rPr>
-          <w:color w:val="000000" w:themeColor="text1"/>
-          <w:lang w:val="en-US"/>
-        </w:rPr>
-      </w:pPr>
-      <w:r>
-        <w:rPr>
-          <w:color w:val="000000" w:themeColor="text1"/>
-          <w:lang w:val="en-US"/>
-        </w:rPr>
-        <w:t>In the terminal, type the following command</w:t>
-      </w:r>
-    </w:p>
-    <w:p>
-      <w:pPr>
-        <w:pBdr>
-          <w:top w:val="single" w:sz="6" w:space="1" w:color="auto"/>
-          <w:bottom w:val="single" w:sz="6" w:space="1" w:color="auto"/>
-        </w:pBdr>
-        <w:ind w:left="720"/>
-        <w:rPr>
-          <w:b/>
-          <w:bCs/>
-          <w:lang w:val="en-US"/>
-        </w:rPr>
-      </w:pPr>
-      <w:r>
-        <w:rPr>
-          <w:b/>
-          <w:bCs/>
-          <w:lang w:val="en-US"/>
-        </w:rPr>
-        <w:t>python data_cleaner.py</w:t>
-      </w:r>
-    </w:p>
-    <w:p>
-      <w:pPr>
-        <w:pStyle w:val="ListParagraph"/>
-        <w:numPr>
-          <w:ilvl w:val="0"/>
-          <w:numId w:val="14"/>
-        </w:numPr>
-        <w:rPr>
-          <w:lang w:val="en-US"/>
-        </w:rPr>
-      </w:pPr>
-      <w:r>
-        <w:rPr>
-          <w:lang w:val="en-US"/>
-        </w:rPr>
-        <w:t xml:space="preserve">This will output a new file called: </w:t>
-      </w:r>
-      <w:bookmarkStart w:id="0" w:name="_Hlk218244547"/>
-      <w:r>
-        <w:rPr>
-          <w:lang w:val="en-US"/>
-        </w:rPr>
-        <w:t>‘</w:t>
-      </w:r>
-      <w:r>
-        <w:rPr>
-          <w:lang w:val="en-US"/>
-        </w:rPr>
-        <w:t>cleaned_data.xlsx</w:t>
-      </w:r>
-      <w:r>
-        <w:rPr>
-          <w:lang w:val="en-US"/>
-        </w:rPr>
-        <w:t>’</w:t>
-      </w:r>
-      <w:bookmarkEnd w:id="0"/>
-    </w:p>
-    <w:p>
-      <w:pPr>
-        <w:ind w:left="720"/>
-        <w:rPr>
-          <w:lang w:val="en-US"/>
-        </w:rPr>
-      </w:pPr>
-      <w:r>
-        <w:rPr>
-          <w:lang w:val="en-US"/>
-        </w:rPr>
         <w:drawing>
-          <wp:inline distT="0" distB="0" distL="0" distR="0" wp14:anchorId="110307AE" wp14:editId="73FDC09B">
-            <wp:extent cx="5731510" cy="273685"/>
-            <wp:effectExtent l="0" t="0" r="2540" b="0"/>
-            <wp:docPr id="10" name="Picture 10"/>
+          <wp:anchor distT="0" distB="0" distL="114300" distR="114300" simplePos="0" relativeHeight="251658240" behindDoc="0" locked="0" layoutInCell="1" allowOverlap="1" wp14:anchorId="58B12F3C" wp14:editId="43B5EC56">
+            <wp:simplePos x="0" y="0"/>
+            <wp:positionH relativeFrom="column">
+              <wp:posOffset>762000</wp:posOffset>
+            </wp:positionH>
+            <wp:positionV relativeFrom="paragraph">
+              <wp:posOffset>220980</wp:posOffset>
+            </wp:positionV>
+            <wp:extent cx="4107815" cy="1433830"/>
+            <wp:effectExtent l="0" t="0" r="6985" b="0"/>
+            <wp:wrapTopAndBottom/>
+            <wp:docPr id="13" name="Picture 13"/>
             <wp:cNvGraphicFramePr>
               <a:graphicFrameLocks xmlns:a="http://schemas.openxmlformats.org/drawingml/2006/main" noChangeAspect="1"/>
             </wp:cNvGraphicFramePr>
@@ -2009,7 +2370,13 @@
                     <pic:cNvPicPr/>
                   </pic:nvPicPr>
                   <pic:blipFill>
-                    <a:blip r:embed="rId17"/>
+                    <a:blip r:embed="rId16">
+                      <a:extLst>
+                        <a:ext uri="{28A0092B-C50C-407E-A947-70E740481C1C}">
+                          <a14:useLocalDpi xmlns:a14="http://schemas.microsoft.com/office/drawing/2010/main" val="0"/>
+                        </a:ext>
+                      </a:extLst>
+                    </a:blip>
                     <a:stretch>
                       <a:fillRect/>
                     </a:stretch>
@@ -2017,7 +2384,7 @@
                   <pic:spPr>
                     <a:xfrm>
                       <a:off x="0" y="0"/>
-                      <a:ext cx="5731510" cy="273685"/>
+                      <a:ext cx="4107815" cy="1433830"/>
                     </a:xfrm>
                     <a:prstGeom prst="rect">
                       <a:avLst/>
@@ -2026,26 +2393,336 @@
                 </pic:pic>
               </a:graphicData>
             </a:graphic>
-          </wp:inline>
+            <wp14:sizeRelH relativeFrom="margin">
+              <wp14:pctWidth>0</wp14:pctWidth>
+            </wp14:sizeRelH>
+            <wp14:sizeRelV relativeFrom="margin">
+              <wp14:pctHeight>0</wp14:pctHeight>
+            </wp14:sizeRelV>
+          </wp:anchor>
         </w:drawing>
       </w:r>
-    </w:p>
-    <w:p>
-      <w:pPr>
-        <w:ind w:left="1440"/>
+      <w:r>
+        <w:rPr>
+          <w:lang w:val="en-US"/>
+        </w:rPr>
+        <w:t>Add a new app password name</w:t>
+      </w:r>
+      <w:r>
         <w:rPr>
           <w:noProof/>
         </w:rPr>
-      </w:pPr>
-      <w:r>
-        <w:rPr>
-          <w:lang w:val="en-US"/>
-        </w:rPr>
+        <w:t xml:space="preserve"> </w:t>
+      </w:r>
+    </w:p>
+    <w:p>
+      <w:pPr>
+        <w:pStyle w:val="ListParagraph"/>
+        <w:numPr>
+          <w:ilvl w:val="1"/>
+          <w:numId w:val="17"/>
+        </w:numPr>
+        <w:rPr>
+          <w:lang w:val="en-US"/>
+        </w:rPr>
+      </w:pPr>
+      <w:r>
+        <w:rPr>
+          <w:b/>
+          <w:bCs/>
+          <w:lang w:val="en-US"/>
+        </w:rPr>
+        <w:lastRenderedPageBreak/>
         <w:drawing>
-          <wp:inline distT="0" distB="0" distL="0" distR="0" wp14:anchorId="13B12296" wp14:editId="0D889C0D">
-            <wp:extent cx="2648320" cy="247685"/>
-            <wp:effectExtent l="0" t="0" r="0" b="0"/>
-            <wp:docPr id="11" name="Picture 11"/>
+          <wp:anchor distT="0" distB="0" distL="114300" distR="114300" simplePos="0" relativeHeight="251659264" behindDoc="0" locked="0" layoutInCell="1" allowOverlap="1" wp14:anchorId="44647442" wp14:editId="7894DAE1">
+            <wp:simplePos x="0" y="0"/>
+            <wp:positionH relativeFrom="column">
+              <wp:posOffset>1447222</wp:posOffset>
+            </wp:positionH>
+            <wp:positionV relativeFrom="paragraph">
+              <wp:posOffset>367030</wp:posOffset>
+            </wp:positionV>
+            <wp:extent cx="3173730" cy="2660015"/>
+            <wp:effectExtent l="0" t="0" r="7620" b="6985"/>
+            <wp:wrapTopAndBottom/>
+            <wp:docPr id="14" name="Picture 14"/>
+            <wp:cNvGraphicFramePr>
+              <a:graphicFrameLocks xmlns:a="http://schemas.openxmlformats.org/drawingml/2006/main" noChangeAspect="1"/>
+            </wp:cNvGraphicFramePr>
+            <a:graphic xmlns:a="http://schemas.openxmlformats.org/drawingml/2006/main">
+              <a:graphicData uri="http://schemas.openxmlformats.org/drawingml/2006/picture">
+                <pic:pic xmlns:pic="http://schemas.openxmlformats.org/drawingml/2006/picture">
+                  <pic:nvPicPr>
+                    <pic:cNvPr id="1" name=""/>
+                    <pic:cNvPicPr/>
+                  </pic:nvPicPr>
+                  <pic:blipFill>
+                    <a:blip r:embed="rId17">
+                      <a:extLst>
+                        <a:ext uri="{28A0092B-C50C-407E-A947-70E740481C1C}">
+                          <a14:useLocalDpi xmlns:a14="http://schemas.microsoft.com/office/drawing/2010/main" val="0"/>
+                        </a:ext>
+                      </a:extLst>
+                    </a:blip>
+                    <a:stretch>
+                      <a:fillRect/>
+                    </a:stretch>
+                  </pic:blipFill>
+                  <pic:spPr>
+                    <a:xfrm>
+                      <a:off x="0" y="0"/>
+                      <a:ext cx="3173730" cy="2660015"/>
+                    </a:xfrm>
+                    <a:prstGeom prst="rect">
+                      <a:avLst/>
+                    </a:prstGeom>
+                  </pic:spPr>
+                </pic:pic>
+              </a:graphicData>
+            </a:graphic>
+            <wp14:sizeRelH relativeFrom="margin">
+              <wp14:pctWidth>0</wp14:pctWidth>
+            </wp14:sizeRelH>
+            <wp14:sizeRelV relativeFrom="margin">
+              <wp14:pctHeight>0</wp14:pctHeight>
+            </wp14:sizeRelV>
+          </wp:anchor>
+        </w:drawing>
+      </w:r>
+      <w:r>
+        <w:rPr>
+          <w:lang w:val="en-US"/>
+        </w:rPr>
+        <w:t xml:space="preserve">Click on create, it will show you an OTP, copy that, and </w:t>
+      </w:r>
+      <w:r>
+        <w:rPr>
+          <w:b/>
+          <w:bCs/>
+          <w:lang w:val="en-US"/>
+        </w:rPr>
+        <w:t>paste the OTP in line 5 after “=”</w:t>
+      </w:r>
+    </w:p>
+    <w:p>
+      <w:pPr>
+        <w:pStyle w:val="ListParagraph"/>
+        <w:numPr>
+          <w:ilvl w:val="0"/>
+          <w:numId w:val="17"/>
+        </w:numPr>
+        <w:rPr>
+          <w:lang w:val="en-US"/>
+        </w:rPr>
+      </w:pPr>
+      <w:r>
+        <w:rPr>
+          <w:lang w:val="en-US"/>
+        </w:rPr>
+        <w:t xml:space="preserve">In lines 7 and 8, enter your </w:t>
+      </w:r>
+      <w:proofErr w:type="spellStart"/>
+      <w:r>
+        <w:rPr>
+          <w:lang w:val="en-US"/>
+        </w:rPr>
+        <w:t>whatsapp</w:t>
+      </w:r>
+      <w:proofErr w:type="spellEnd"/>
+      <w:r>
+        <w:rPr>
+          <w:lang w:val="en-US"/>
+        </w:rPr>
+        <w:t xml:space="preserve"> Business API credentials</w:t>
+      </w:r>
+    </w:p>
+    <w:p>
+      <w:pPr>
+        <w:pStyle w:val="ListParagraph"/>
+        <w:numPr>
+          <w:ilvl w:val="0"/>
+          <w:numId w:val="17"/>
+        </w:numPr>
+        <w:rPr>
+          <w:lang w:val="en-US"/>
+        </w:rPr>
+      </w:pPr>
+      <w:r>
+        <w:rPr>
+          <w:color w:val="000000" w:themeColor="text1"/>
+          <w:lang w:val="en-US"/>
+        </w:rPr>
+        <w:t>Save the file (ctrl + S)</w:t>
+      </w:r>
+    </w:p>
+    <w:p>
+      <w:pPr>
+        <w:ind w:left="720"/>
+        <w:jc w:val="center"/>
+        <w:rPr>
+          <w:b/>
+          <w:bCs/>
+          <w:color w:val="C00000"/>
+          <w:sz w:val="28"/>
+          <w:szCs w:val="28"/>
+          <w:lang w:val="en-US"/>
+        </w:rPr>
+      </w:pPr>
+    </w:p>
+    <w:p>
+      <w:pPr>
+        <w:pStyle w:val="ListParagraph"/>
+        <w:numPr>
+          <w:ilvl w:val="0"/>
+          <w:numId w:val="6"/>
+        </w:numPr>
+        <w:jc w:val="center"/>
+        <w:rPr>
+          <w:b/>
+          <w:bCs/>
+          <w:color w:val="C00000"/>
+          <w:sz w:val="28"/>
+          <w:szCs w:val="28"/>
+          <w:lang w:val="en-US"/>
+        </w:rPr>
+      </w:pPr>
+      <w:r>
+        <w:rPr>
+          <w:b/>
+          <w:bCs/>
+          <w:color w:val="C00000"/>
+          <w:sz w:val="28"/>
+          <w:szCs w:val="28"/>
+          <w:lang w:val="en-US"/>
+        </w:rPr>
+        <w:t>Your Setup is completed, Now, you don’t need to do anything except step (2) every</w:t>
+      </w:r>
+      <w:r>
+        <w:rPr>
+          <w:b/>
+          <w:bCs/>
+          <w:color w:val="C00000"/>
+          <w:sz w:val="28"/>
+          <w:szCs w:val="28"/>
+          <w:lang w:val="en-US"/>
+        </w:rPr>
+        <w:t xml:space="preserve"> </w:t>
+      </w:r>
+      <w:r>
+        <w:rPr>
+          <w:b/>
+          <w:bCs/>
+          <w:color w:val="C00000"/>
+          <w:sz w:val="28"/>
+          <w:szCs w:val="28"/>
+          <w:lang w:val="en-US"/>
+        </w:rPr>
+        <w:t>time you want to run the code</w:t>
+      </w:r>
+    </w:p>
+    <w:p>
+      <w:pPr>
+        <w:pStyle w:val="ListParagraph"/>
+        <w:numPr>
+          <w:ilvl w:val="0"/>
+          <w:numId w:val="6"/>
+        </w:numPr>
+        <w:jc w:val="center"/>
+        <w:rPr>
+          <w:b/>
+          <w:bCs/>
+          <w:color w:val="C00000"/>
+          <w:sz w:val="28"/>
+          <w:szCs w:val="28"/>
+          <w:lang w:val="en-US"/>
+        </w:rPr>
+      </w:pPr>
+      <w:r>
+        <w:rPr>
+          <w:b/>
+          <w:bCs/>
+          <w:color w:val="C00000"/>
+          <w:sz w:val="28"/>
+          <w:szCs w:val="28"/>
+          <w:lang w:val="en-US"/>
+        </w:rPr>
+        <w:t xml:space="preserve">The Indicator for an Active Virtual Environment is </w:t>
+      </w:r>
+      <w:r>
+        <w:rPr>
+          <w:b/>
+          <w:bCs/>
+          <w:color w:val="00B050"/>
+          <w:sz w:val="28"/>
+          <w:szCs w:val="28"/>
+          <w:lang w:val="en-US"/>
+        </w:rPr>
+        <w:t>(</w:t>
+      </w:r>
+      <w:proofErr w:type="spellStart"/>
+      <w:r>
+        <w:rPr>
+          <w:b/>
+          <w:bCs/>
+          <w:color w:val="00B050"/>
+          <w:sz w:val="28"/>
+          <w:szCs w:val="28"/>
+          <w:lang w:val="en-US"/>
+        </w:rPr>
+        <w:t>venv</w:t>
+      </w:r>
+      <w:proofErr w:type="spellEnd"/>
+      <w:r>
+        <w:rPr>
+          <w:b/>
+          <w:bCs/>
+          <w:color w:val="00B050"/>
+          <w:sz w:val="28"/>
+          <w:szCs w:val="28"/>
+          <w:lang w:val="en-US"/>
+        </w:rPr>
+        <w:t xml:space="preserve">) </w:t>
+      </w:r>
+      <w:r>
+        <w:rPr>
+          <w:b/>
+          <w:bCs/>
+          <w:color w:val="C00000"/>
+          <w:sz w:val="28"/>
+          <w:szCs w:val="28"/>
+          <w:lang w:val="en-US"/>
+        </w:rPr>
+        <w:t>in your command terminal</w:t>
+      </w:r>
+    </w:p>
+    <w:p>
+      <w:pPr>
+        <w:ind w:left="360"/>
+        <w:jc w:val="center"/>
+        <w:rPr>
+          <w:b/>
+          <w:bCs/>
+          <w:color w:val="C00000"/>
+          <w:sz w:val="28"/>
+          <w:szCs w:val="28"/>
+          <w:lang w:val="en-US"/>
+        </w:rPr>
+      </w:pPr>
+      <w:r>
+        <w:rPr>
+          <w:b/>
+          <w:bCs/>
+          <w:noProof/>
+          <w:color w:val="C00000"/>
+          <w:sz w:val="28"/>
+          <w:szCs w:val="28"/>
+          <w:lang w:val="en-US"/>
+        </w:rPr>
+        <w:drawing>
+          <wp:inline distT="0" distB="0" distL="0" distR="0" wp14:anchorId="64E33E7F" wp14:editId="31BB81C1">
+            <wp:extent cx="5731510" cy="263525"/>
+            <wp:effectExtent l="0" t="0" r="2540" b="3175"/>
+            <wp:docPr id="19" name="Picture 19"/>
             <wp:cNvGraphicFramePr>
               <a:graphicFrameLocks xmlns:a="http://schemas.openxmlformats.org/drawingml/2006/main" noChangeAspect="1"/>
             </wp:cNvGraphicFramePr>
@@ -2065,7 +2742,7 @@
                   <pic:spPr>
                     <a:xfrm>
                       <a:off x="0" y="0"/>
-                      <a:ext cx="2648320" cy="247685"/>
+                      <a:ext cx="5731510" cy="263525"/>
                     </a:xfrm>
                     <a:prstGeom prst="rect">
                       <a:avLst/>
@@ -2077,21 +2754,257 @@
           </wp:inline>
         </w:drawing>
       </w:r>
+    </w:p>
+    <w:p>
+      <w:pPr>
+        <w:rPr>
+          <w:b/>
+          <w:bCs/>
+          <w:color w:val="C00000"/>
+          <w:sz w:val="28"/>
+          <w:szCs w:val="28"/>
+          <w:lang w:val="en-US"/>
+        </w:rPr>
+      </w:pPr>
+      <w:r>
+        <w:rPr>
+          <w:b/>
+          <w:bCs/>
+          <w:color w:val="C00000"/>
+          <w:sz w:val="28"/>
+          <w:szCs w:val="28"/>
+          <w:lang w:val="en-US"/>
+        </w:rPr>
+        <w:br w:type="page"/>
+      </w:r>
+    </w:p>
+    <w:p>
+      <w:pPr>
+        <w:pStyle w:val="Heading2"/>
+        <w:rPr>
+          <w:b/>
+          <w:bCs/>
+          <w:sz w:val="40"/>
+          <w:szCs w:val="40"/>
+          <w:lang w:val="en-US"/>
+        </w:rPr>
+      </w:pPr>
+      <w:r>
+        <w:rPr>
+          <w:b/>
+          <w:bCs/>
+          <w:sz w:val="40"/>
+          <w:szCs w:val="40"/>
+          <w:lang w:val="en-US"/>
+        </w:rPr>
+        <w:lastRenderedPageBreak/>
+        <w:t>Running the code and application</w:t>
+      </w:r>
+    </w:p>
+    <w:p>
+      <w:pPr>
+        <w:pStyle w:val="Heading2"/>
+        <w:rPr>
+          <w:lang w:val="en-US"/>
+        </w:rPr>
+      </w:pPr>
+      <w:r>
+        <w:rPr>
+          <w:lang w:val="en-US"/>
+        </w:rPr>
+        <w:t>1.  How to clean data</w:t>
+      </w:r>
+    </w:p>
+    <w:p>
+      <w:pPr>
+        <w:pStyle w:val="ListParagraph"/>
+        <w:numPr>
+          <w:ilvl w:val="0"/>
+          <w:numId w:val="14"/>
+        </w:numPr>
+        <w:rPr>
+          <w:lang w:val="en-US"/>
+        </w:rPr>
+      </w:pPr>
+      <w:r>
+        <w:rPr>
+          <w:lang w:val="en-US"/>
+        </w:rPr>
+        <w:t xml:space="preserve">First, make sure that </w:t>
+      </w:r>
+      <w:r>
+        <w:rPr>
+          <w:b/>
+          <w:bCs/>
+          <w:lang w:val="en-US"/>
+        </w:rPr>
+        <w:t>‘’data.xlsx”</w:t>
+      </w:r>
+      <w:r>
+        <w:rPr>
+          <w:lang w:val="en-US"/>
+        </w:rPr>
+        <w:t xml:space="preserve"> is the name of the file in which you have the raw data</w:t>
+      </w:r>
+    </w:p>
+    <w:p>
+      <w:pPr>
+        <w:pStyle w:val="ListParagraph"/>
+        <w:numPr>
+          <w:ilvl w:val="0"/>
+          <w:numId w:val="14"/>
+        </w:numPr>
+        <w:rPr>
+          <w:lang w:val="en-US"/>
+        </w:rPr>
+      </w:pPr>
+      <w:r>
+        <w:rPr>
+          <w:lang w:val="en-US"/>
+        </w:rPr>
+        <w:t>Paste that file inside the project folder</w:t>
+      </w:r>
+    </w:p>
+    <w:p>
+      <w:pPr>
+        <w:pStyle w:val="ListParagraph"/>
+        <w:numPr>
+          <w:ilvl w:val="0"/>
+          <w:numId w:val="14"/>
+        </w:numPr>
+        <w:rPr>
+          <w:color w:val="C00000"/>
+          <w:lang w:val="en-US"/>
+        </w:rPr>
+      </w:pPr>
+      <w:r>
+        <w:rPr>
+          <w:color w:val="C00000"/>
+          <w:lang w:val="en-US"/>
+        </w:rPr>
+        <w:t xml:space="preserve">Activate Virtual Environment if you haven’t </w:t>
+      </w:r>
+      <w:r>
+        <w:rPr>
+          <w:color w:val="C00000"/>
+          <w:lang w:val="en-US"/>
+        </w:rPr>
+        <w:t>(</w:t>
+      </w:r>
+      <w:proofErr w:type="spellStart"/>
+      <w:r>
+        <w:rPr>
+          <w:color w:val="C00000"/>
+          <w:lang w:val="en-US"/>
+        </w:rPr>
+        <w:t>venv</w:t>
+      </w:r>
+      <w:proofErr w:type="spellEnd"/>
+      <w:r>
+        <w:rPr>
+          <w:color w:val="C00000"/>
+          <w:lang w:val="en-US"/>
+        </w:rPr>
+        <w:t>/Scripts/activate)</w:t>
+      </w:r>
+    </w:p>
+    <w:p>
+      <w:pPr>
+        <w:pStyle w:val="ListParagraph"/>
+        <w:numPr>
+          <w:ilvl w:val="0"/>
+          <w:numId w:val="14"/>
+        </w:numPr>
+        <w:rPr>
+          <w:color w:val="000000" w:themeColor="text1"/>
+          <w:lang w:val="en-US"/>
+        </w:rPr>
+      </w:pPr>
+      <w:r>
+        <w:rPr>
+          <w:color w:val="000000" w:themeColor="text1"/>
+          <w:lang w:val="en-US"/>
+        </w:rPr>
+        <w:t>In the terminal, type the following command</w:t>
+      </w:r>
+    </w:p>
+    <w:p>
+      <w:pPr>
+        <w:pBdr>
+          <w:top w:val="single" w:sz="6" w:space="1" w:color="auto"/>
+          <w:bottom w:val="single" w:sz="6" w:space="1" w:color="auto"/>
+        </w:pBdr>
+        <w:ind w:left="720"/>
+        <w:rPr>
+          <w:b/>
+          <w:bCs/>
+          <w:lang w:val="en-US"/>
+        </w:rPr>
+      </w:pPr>
+      <w:r>
+        <w:rPr>
+          <w:b/>
+          <w:bCs/>
+          <w:lang w:val="en-US"/>
+        </w:rPr>
+        <w:t>python data_cleaner.py</w:t>
+      </w:r>
+    </w:p>
+    <w:p>
+      <w:pPr>
+        <w:pStyle w:val="ListParagraph"/>
+        <w:numPr>
+          <w:ilvl w:val="0"/>
+          <w:numId w:val="14"/>
+        </w:numPr>
+        <w:rPr>
+          <w:lang w:val="en-US"/>
+        </w:rPr>
+      </w:pPr>
+      <w:r>
+        <w:rPr>
+          <w:lang w:val="en-US"/>
+        </w:rPr>
+        <w:t xml:space="preserve">This will output a new file called: </w:t>
+      </w:r>
+      <w:bookmarkStart w:id="0" w:name="_Hlk218244547"/>
+      <w:r>
+        <w:rPr>
+          <w:lang w:val="en-US"/>
+        </w:rPr>
+        <w:t>‘</w:t>
+      </w:r>
+      <w:r>
+        <w:rPr>
+          <w:lang w:val="en-US"/>
+        </w:rPr>
+        <w:t>cleaned_data.xlsx</w:t>
+      </w:r>
+      <w:r>
+        <w:rPr>
+          <w:lang w:val="en-US"/>
+        </w:rPr>
+        <w:t>’</w:t>
+      </w:r>
+      <w:bookmarkEnd w:id="0"/>
+    </w:p>
+    <w:p>
+      <w:pPr>
+        <w:ind w:left="720"/>
+        <w:rPr>
+          <w:lang w:val="en-US"/>
+        </w:rPr>
+      </w:pPr>
       <w:r>
         <w:rPr>
           <w:noProof/>
-        </w:rPr>
-        <w:t xml:space="preserve"> </w:t>
-      </w:r>
-      <w:r>
-        <w:rPr>
           <w:lang w:val="en-US"/>
         </w:rPr>
         <w:drawing>
-          <wp:inline distT="0" distB="0" distL="0" distR="0" wp14:anchorId="6E46082D" wp14:editId="0FB4A55B">
-            <wp:extent cx="1714739" cy="276264"/>
-            <wp:effectExtent l="0" t="0" r="0" b="9525"/>
-            <wp:docPr id="12" name="Picture 12"/>
+          <wp:inline distT="0" distB="0" distL="0" distR="0" wp14:anchorId="110307AE" wp14:editId="73FDC09B">
+            <wp:extent cx="5731510" cy="273685"/>
+            <wp:effectExtent l="0" t="0" r="2540" b="0"/>
+            <wp:docPr id="10" name="Picture 10"/>
             <wp:cNvGraphicFramePr>
               <a:graphicFrameLocks xmlns:a="http://schemas.openxmlformats.org/drawingml/2006/main" noChangeAspect="1"/>
             </wp:cNvGraphicFramePr>
@@ -2111,7 +3024,7 @@
                   <pic:spPr>
                     <a:xfrm>
                       <a:off x="0" y="0"/>
-                      <a:ext cx="1714739" cy="276264"/>
+                      <a:ext cx="5731510" cy="273685"/>
                     </a:xfrm>
                     <a:prstGeom prst="rect">
                       <a:avLst/>
@@ -2126,218 +3039,21 @@
     </w:p>
     <w:p>
       <w:pPr>
-        <w:pStyle w:val="Heading2"/>
-        <w:rPr>
-          <w:lang w:val="en-US"/>
-        </w:rPr>
-      </w:pPr>
-      <w:r>
-        <w:rPr>
-          <w:lang w:val="en-US"/>
-        </w:rPr>
-        <w:t>2</w:t>
-      </w:r>
-      <w:r>
-        <w:rPr>
-          <w:lang w:val="en-US"/>
-        </w:rPr>
-        <w:t xml:space="preserve">.  How to </w:t>
-      </w:r>
-      <w:r>
-        <w:rPr>
-          <w:lang w:val="en-US"/>
-        </w:rPr>
-        <w:t>run analytics and Machine Learning Models</w:t>
-      </w:r>
-    </w:p>
-    <w:p>
-      <w:pPr>
-        <w:pStyle w:val="ListParagraph"/>
-        <w:numPr>
-          <w:ilvl w:val="0"/>
-          <w:numId w:val="16"/>
-        </w:numPr>
-        <w:rPr>
-          <w:lang w:val="en-US"/>
-        </w:rPr>
-      </w:pPr>
-      <w:r>
-        <w:rPr>
-          <w:lang w:val="en-US"/>
-        </w:rPr>
-        <w:t xml:space="preserve">First, make sure that </w:t>
-      </w:r>
-      <w:r>
-        <w:rPr>
-          <w:b/>
-          <w:bCs/>
-          <w:lang w:val="en-US"/>
-        </w:rPr>
-        <w:t>“</w:t>
-      </w:r>
-      <w:r>
-        <w:rPr>
-          <w:b/>
-          <w:bCs/>
-          <w:lang w:val="en-US"/>
-        </w:rPr>
-        <w:t>cleaned_data.xlsx</w:t>
-      </w:r>
-      <w:r>
-        <w:rPr>
-          <w:b/>
-          <w:bCs/>
-          <w:lang w:val="en-US"/>
-        </w:rPr>
-        <w:t>”</w:t>
-      </w:r>
-      <w:r>
-        <w:rPr>
-          <w:lang w:val="en-US"/>
-        </w:rPr>
-        <w:t xml:space="preserve"> is present in your project folder</w:t>
-      </w:r>
-    </w:p>
-    <w:p>
-      <w:pPr>
-        <w:pStyle w:val="ListParagraph"/>
-        <w:numPr>
-          <w:ilvl w:val="0"/>
-          <w:numId w:val="16"/>
-        </w:numPr>
-        <w:rPr>
-          <w:lang w:val="en-US"/>
-        </w:rPr>
-      </w:pPr>
-      <w:r>
-        <w:rPr>
-          <w:lang w:val="en-US"/>
-        </w:rPr>
-        <w:t xml:space="preserve">Open the file </w:t>
-      </w:r>
-      <w:r>
-        <w:rPr>
-          <w:b/>
-          <w:bCs/>
-          <w:lang w:val="en-US"/>
-        </w:rPr>
-        <w:t>‘</w:t>
-      </w:r>
-      <w:r>
-        <w:rPr>
-          <w:b/>
-          <w:bCs/>
-          <w:lang w:val="en-US"/>
-        </w:rPr>
-        <w:t>integrated-timeline.ipynb</w:t>
-      </w:r>
-      <w:r>
-        <w:rPr>
-          <w:b/>
-          <w:bCs/>
-          <w:lang w:val="en-US"/>
-        </w:rPr>
-        <w:t>’</w:t>
-      </w:r>
-    </w:p>
-    <w:p>
-      <w:pPr>
-        <w:pStyle w:val="ListParagraph"/>
-        <w:numPr>
-          <w:ilvl w:val="0"/>
-          <w:numId w:val="16"/>
-        </w:numPr>
-        <w:rPr>
-          <w:lang w:val="en-US"/>
-        </w:rPr>
-      </w:pPr>
-      <w:r>
-        <w:rPr>
-          <w:lang w:val="en-US"/>
-        </w:rPr>
-        <w:t xml:space="preserve">This is a Jupyter notebook, now, </w:t>
-      </w:r>
-      <w:r>
-        <w:rPr>
-          <w:lang w:val="en-US"/>
-        </w:rPr>
-        <w:t xml:space="preserve">select your </w:t>
-      </w:r>
-      <w:r>
-        <w:rPr>
-          <w:b/>
-          <w:bCs/>
-          <w:lang w:val="en-US"/>
-        </w:rPr>
-        <w:t>venv</w:t>
-      </w:r>
-      <w:r>
-        <w:rPr>
-          <w:lang w:val="en-US"/>
-        </w:rPr>
-        <w:t xml:space="preserve"> as the kernal</w:t>
-      </w:r>
-      <w:r>
-        <w:rPr>
-          <w:lang w:val="en-US"/>
-        </w:rPr>
-        <w:t xml:space="preserve">. </w:t>
-      </w:r>
-    </w:p>
-    <w:p>
-      <w:pPr>
-        <w:pStyle w:val="ListParagraph"/>
-        <w:numPr>
-          <w:ilvl w:val="0"/>
-          <w:numId w:val="16"/>
-        </w:numPr>
-        <w:rPr>
-          <w:lang w:val="en-US"/>
-        </w:rPr>
-      </w:pPr>
-      <w:r>
-        <w:rPr>
-          <w:lang w:val="en-US"/>
-        </w:rPr>
-        <w:t>First click on ‘Select Kernal’</w:t>
-      </w:r>
-      <w:r>
-        <w:rPr>
-          <w:lang w:val="en-US"/>
-        </w:rPr>
-        <w:t xml:space="preserve">. If it already shows </w:t>
-      </w:r>
-      <w:r>
-        <w:rPr>
-          <w:b/>
-          <w:bCs/>
-          <w:lang w:val="en-US"/>
-        </w:rPr>
-        <w:t>‘venv’</w:t>
-      </w:r>
-      <w:r>
-        <w:rPr>
-          <w:lang w:val="en-US"/>
-        </w:rPr>
-        <w:t xml:space="preserve"> then you may skip step 4, 5 and 6.</w:t>
-      </w:r>
-    </w:p>
-    <w:p>
-      <w:pPr>
-        <w:ind w:left="720"/>
-        <w:rPr>
-          <w:lang w:val="en-US"/>
-        </w:rPr>
-      </w:pPr>
-      <w:r>
-        <w:rPr>
+        <w:ind w:left="1440"/>
+        <w:rPr>
+          <w:noProof/>
+        </w:rPr>
+      </w:pPr>
+      <w:r>
+        <w:rPr>
+          <w:noProof/>
           <w:lang w:val="en-US"/>
         </w:rPr>
         <w:drawing>
-          <wp:inline distT="0" distB="0" distL="0" distR="0" wp14:anchorId="4CA5EB9D" wp14:editId="29D308B6">
-            <wp:extent cx="5731510" cy="1006475"/>
-            <wp:effectExtent l="0" t="0" r="2540" b="3175"/>
-            <wp:docPr id="21" name="Picture 21"/>
+          <wp:inline distT="0" distB="0" distL="0" distR="0" wp14:anchorId="13B12296" wp14:editId="0D889C0D">
+            <wp:extent cx="2648320" cy="247685"/>
+            <wp:effectExtent l="0" t="0" r="0" b="0"/>
+            <wp:docPr id="11" name="Picture 11"/>
             <wp:cNvGraphicFramePr>
               <a:graphicFrameLocks xmlns:a="http://schemas.openxmlformats.org/drawingml/2006/main" noChangeAspect="1"/>
             </wp:cNvGraphicFramePr>
@@ -2357,7 +3073,7 @@
                   <pic:spPr>
                     <a:xfrm>
                       <a:off x="0" y="0"/>
-                      <a:ext cx="5731510" cy="1006475"/>
+                      <a:ext cx="2648320" cy="247685"/>
                     </a:xfrm>
                     <a:prstGeom prst="rect">
                       <a:avLst/>
@@ -2369,41 +3085,22 @@
           </wp:inline>
         </w:drawing>
       </w:r>
-    </w:p>
-    <w:p>
-      <w:pPr>
-        <w:pStyle w:val="ListParagraph"/>
-        <w:numPr>
-          <w:ilvl w:val="0"/>
-          <w:numId w:val="16"/>
-        </w:numPr>
-        <w:rPr>
-          <w:lang w:val="en-US"/>
-        </w:rPr>
-      </w:pPr>
-      <w:r>
-        <w:rPr>
-          <w:lang w:val="en-US"/>
-        </w:rPr>
-        <w:t>Click on ‘Python Environements’</w:t>
-      </w:r>
-    </w:p>
-    <w:p>
-      <w:pPr>
-        <w:ind w:left="720"/>
-        <w:rPr>
-          <w:lang w:val="en-US"/>
-        </w:rPr>
-      </w:pPr>
-      <w:r>
-        <w:rPr>
+      <w:r>
+        <w:rPr>
+          <w:noProof/>
+        </w:rPr>
+        <w:t xml:space="preserve"> </w:t>
+      </w:r>
+      <w:r>
+        <w:rPr>
+          <w:noProof/>
           <w:lang w:val="en-US"/>
         </w:rPr>
         <w:drawing>
-          <wp:inline distT="0" distB="0" distL="0" distR="0" wp14:anchorId="4DBE7A3A" wp14:editId="68593A4A">
-            <wp:extent cx="5731510" cy="1224915"/>
-            <wp:effectExtent l="0" t="0" r="2540" b="0"/>
-            <wp:docPr id="22" name="Picture 22"/>
+          <wp:inline distT="0" distB="0" distL="0" distR="0" wp14:anchorId="6E46082D" wp14:editId="0FB4A55B">
+            <wp:extent cx="1714739" cy="276264"/>
+            <wp:effectExtent l="0" t="0" r="0" b="9525"/>
+            <wp:docPr id="12" name="Picture 12"/>
             <wp:cNvGraphicFramePr>
               <a:graphicFrameLocks xmlns:a="http://schemas.openxmlformats.org/drawingml/2006/main" noChangeAspect="1"/>
             </wp:cNvGraphicFramePr>
@@ -2423,7 +3120,7 @@
                   <pic:spPr>
                     <a:xfrm>
                       <a:off x="0" y="0"/>
-                      <a:ext cx="5731510" cy="1224915"/>
+                      <a:ext cx="1714739" cy="276264"/>
                     </a:xfrm>
                     <a:prstGeom prst="rect">
                       <a:avLst/>
@@ -2438,6 +3135,20 @@
     </w:p>
     <w:p>
       <w:pPr>
+        <w:pStyle w:val="Heading2"/>
+        <w:rPr>
+          <w:lang w:val="en-US"/>
+        </w:rPr>
+      </w:pPr>
+      <w:r>
+        <w:rPr>
+          <w:lang w:val="en-US"/>
+        </w:rPr>
+        <w:t>2.  How to run analytics and Machine Learning Models</w:t>
+      </w:r>
+    </w:p>
+    <w:p>
+      <w:pPr>
         <w:pStyle w:val="ListParagraph"/>
         <w:numPr>
           <w:ilvl w:val="0"/>
@@ -2451,7 +3162,213 @@
         <w:rPr>
           <w:lang w:val="en-US"/>
         </w:rPr>
-        <w:t>Click on ‘venv’</w:t>
+        <w:t xml:space="preserve">First, make sure that </w:t>
+      </w:r>
+      <w:r>
+        <w:rPr>
+          <w:b/>
+          <w:bCs/>
+          <w:lang w:val="en-US"/>
+        </w:rPr>
+        <w:t>“</w:t>
+      </w:r>
+      <w:r>
+        <w:rPr>
+          <w:b/>
+          <w:bCs/>
+          <w:lang w:val="en-US"/>
+        </w:rPr>
+        <w:t>cleaned_data.xlsx</w:t>
+      </w:r>
+      <w:r>
+        <w:rPr>
+          <w:b/>
+          <w:bCs/>
+          <w:lang w:val="en-US"/>
+        </w:rPr>
+        <w:t>”</w:t>
+      </w:r>
+      <w:r>
+        <w:rPr>
+          <w:lang w:val="en-US"/>
+        </w:rPr>
+        <w:t xml:space="preserve"> is present in your project folder</w:t>
+      </w:r>
+    </w:p>
+    <w:p>
+      <w:pPr>
+        <w:pStyle w:val="ListParagraph"/>
+        <w:numPr>
+          <w:ilvl w:val="0"/>
+          <w:numId w:val="16"/>
+        </w:numPr>
+        <w:rPr>
+          <w:lang w:val="en-US"/>
+        </w:rPr>
+      </w:pPr>
+      <w:r>
+        <w:rPr>
+          <w:lang w:val="en-US"/>
+        </w:rPr>
+        <w:t xml:space="preserve">Open the file </w:t>
+      </w:r>
+      <w:r>
+        <w:rPr>
+          <w:b/>
+          <w:bCs/>
+          <w:lang w:val="en-US"/>
+        </w:rPr>
+        <w:t>‘</w:t>
+      </w:r>
+      <w:proofErr w:type="spellStart"/>
+      <w:r>
+        <w:rPr>
+          <w:b/>
+          <w:bCs/>
+          <w:lang w:val="en-US"/>
+        </w:rPr>
+        <w:t>JonathanProj</w:t>
+      </w:r>
+      <w:r>
+        <w:rPr>
+          <w:b/>
+          <w:bCs/>
+          <w:lang w:val="en-US"/>
+        </w:rPr>
+        <w:t>.ipynb</w:t>
+      </w:r>
+      <w:proofErr w:type="spellEnd"/>
+      <w:r>
+        <w:rPr>
+          <w:b/>
+          <w:bCs/>
+          <w:lang w:val="en-US"/>
+        </w:rPr>
+        <w:t>’</w:t>
+      </w:r>
+    </w:p>
+    <w:p>
+      <w:pPr>
+        <w:pStyle w:val="ListParagraph"/>
+        <w:numPr>
+          <w:ilvl w:val="0"/>
+          <w:numId w:val="16"/>
+        </w:numPr>
+        <w:rPr>
+          <w:lang w:val="en-US"/>
+        </w:rPr>
+      </w:pPr>
+      <w:r>
+        <w:rPr>
+          <w:lang w:val="en-US"/>
+        </w:rPr>
+        <w:t xml:space="preserve">This is a </w:t>
+      </w:r>
+      <w:proofErr w:type="spellStart"/>
+      <w:r>
+        <w:rPr>
+          <w:lang w:val="en-US"/>
+        </w:rPr>
+        <w:t>Jupyter</w:t>
+      </w:r>
+      <w:proofErr w:type="spellEnd"/>
+      <w:r>
+        <w:rPr>
+          <w:lang w:val="en-US"/>
+        </w:rPr>
+        <w:t xml:space="preserve"> notebook, now, </w:t>
+      </w:r>
+      <w:r>
+        <w:rPr>
+          <w:lang w:val="en-US"/>
+        </w:rPr>
+        <w:t xml:space="preserve">select your </w:t>
+      </w:r>
+      <w:proofErr w:type="spellStart"/>
+      <w:r>
+        <w:rPr>
+          <w:b/>
+          <w:bCs/>
+          <w:lang w:val="en-US"/>
+        </w:rPr>
+        <w:t>venv</w:t>
+      </w:r>
+      <w:proofErr w:type="spellEnd"/>
+      <w:r>
+        <w:rPr>
+          <w:lang w:val="en-US"/>
+        </w:rPr>
+        <w:t xml:space="preserve"> as the </w:t>
+      </w:r>
+      <w:proofErr w:type="spellStart"/>
+      <w:r>
+        <w:rPr>
+          <w:lang w:val="en-US"/>
+        </w:rPr>
+        <w:t>kernal</w:t>
+      </w:r>
+      <w:proofErr w:type="spellEnd"/>
+      <w:r>
+        <w:rPr>
+          <w:lang w:val="en-US"/>
+        </w:rPr>
+        <w:t xml:space="preserve">. </w:t>
+      </w:r>
+    </w:p>
+    <w:p>
+      <w:pPr>
+        <w:pStyle w:val="ListParagraph"/>
+        <w:numPr>
+          <w:ilvl w:val="0"/>
+          <w:numId w:val="16"/>
+        </w:numPr>
+        <w:rPr>
+          <w:lang w:val="en-US"/>
+        </w:rPr>
+      </w:pPr>
+      <w:r>
+        <w:rPr>
+          <w:lang w:val="en-US"/>
+        </w:rPr>
+        <w:t>First click on ‘Select Kernal’</w:t>
+      </w:r>
+      <w:r>
+        <w:rPr>
+          <w:lang w:val="en-US"/>
+        </w:rPr>
+        <w:t xml:space="preserve">. If it already shows </w:t>
+      </w:r>
+      <w:r>
+        <w:rPr>
+          <w:b/>
+          <w:bCs/>
+          <w:lang w:val="en-US"/>
+        </w:rPr>
+        <w:t>‘</w:t>
+      </w:r>
+      <w:proofErr w:type="spellStart"/>
+      <w:r>
+        <w:rPr>
+          <w:b/>
+          <w:bCs/>
+          <w:lang w:val="en-US"/>
+        </w:rPr>
+        <w:t>venv</w:t>
+      </w:r>
+      <w:proofErr w:type="spellEnd"/>
+      <w:r>
+        <w:rPr>
+          <w:b/>
+          <w:bCs/>
+          <w:lang w:val="en-US"/>
+        </w:rPr>
+        <w:t>’</w:t>
+      </w:r>
+      <w:r>
+        <w:rPr>
+          <w:lang w:val="en-US"/>
+        </w:rPr>
+        <w:t xml:space="preserve"> then you may skip step 4, 5 and 6.</w:t>
       </w:r>
     </w:p>
     <w:p>
@@ -2463,13 +3380,14 @@
       </w:pPr>
       <w:r>
         <w:rPr>
+          <w:noProof/>
           <w:lang w:val="en-US"/>
         </w:rPr>
         <w:drawing>
-          <wp:inline distT="0" distB="0" distL="0" distR="0" wp14:anchorId="2F182333" wp14:editId="4C0B2CC0">
-            <wp:extent cx="4363059" cy="447737"/>
-            <wp:effectExtent l="0" t="0" r="0" b="9525"/>
-            <wp:docPr id="23" name="Picture 23"/>
+          <wp:inline distT="0" distB="0" distL="0" distR="0" wp14:anchorId="4CA5EB9D" wp14:editId="29D308B6">
+            <wp:extent cx="5731510" cy="1006475"/>
+            <wp:effectExtent l="0" t="0" r="2540" b="3175"/>
+            <wp:docPr id="21" name="Picture 21"/>
             <wp:cNvGraphicFramePr>
               <a:graphicFrameLocks xmlns:a="http://schemas.openxmlformats.org/drawingml/2006/main" noChangeAspect="1"/>
             </wp:cNvGraphicFramePr>
@@ -2489,7 +3407,7 @@
                   <pic:spPr>
                     <a:xfrm>
                       <a:off x="0" y="0"/>
-                      <a:ext cx="4363059" cy="447737"/>
+                      <a:ext cx="5731510" cy="1006475"/>
                     </a:xfrm>
                     <a:prstGeom prst="rect">
                       <a:avLst/>
@@ -2517,7 +3435,21 @@
         <w:rPr>
           <w:lang w:val="en-US"/>
         </w:rPr>
-        <w:t>Click on the ‘Run all’ button</w:t>
+        <w:t xml:space="preserve">Click on ‘Python </w:t>
+      </w:r>
+      <w:proofErr w:type="spellStart"/>
+      <w:r>
+        <w:rPr>
+          <w:lang w:val="en-US"/>
+        </w:rPr>
+        <w:t>Environements</w:t>
+      </w:r>
+      <w:proofErr w:type="spellEnd"/>
+      <w:r>
+        <w:rPr>
+          <w:lang w:val="en-US"/>
+        </w:rPr>
+        <w:t>’</w:t>
       </w:r>
     </w:p>
     <w:p>
@@ -2529,13 +3461,14 @@
       </w:pPr>
       <w:r>
         <w:rPr>
+          <w:noProof/>
           <w:lang w:val="en-US"/>
         </w:rPr>
         <w:drawing>
-          <wp:inline distT="0" distB="0" distL="0" distR="0" wp14:anchorId="2D3A8B5C" wp14:editId="3A01202A">
-            <wp:extent cx="1305107" cy="485843"/>
-            <wp:effectExtent l="0" t="0" r="0" b="9525"/>
-            <wp:docPr id="24" name="Picture 24"/>
+          <wp:inline distT="0" distB="0" distL="0" distR="0" wp14:anchorId="4DBE7A3A" wp14:editId="68593A4A">
+            <wp:extent cx="5731510" cy="1224915"/>
+            <wp:effectExtent l="0" t="0" r="2540" b="0"/>
+            <wp:docPr id="22" name="Picture 22"/>
             <wp:cNvGraphicFramePr>
               <a:graphicFrameLocks xmlns:a="http://schemas.openxmlformats.org/drawingml/2006/main" noChangeAspect="1"/>
             </wp:cNvGraphicFramePr>
@@ -2555,6 +3488,154 @@
                   <pic:spPr>
                     <a:xfrm>
                       <a:off x="0" y="0"/>
+                      <a:ext cx="5731510" cy="1224915"/>
+                    </a:xfrm>
+                    <a:prstGeom prst="rect">
+                      <a:avLst/>
+                    </a:prstGeom>
+                  </pic:spPr>
+                </pic:pic>
+              </a:graphicData>
+            </a:graphic>
+          </wp:inline>
+        </w:drawing>
+      </w:r>
+    </w:p>
+    <w:p>
+      <w:pPr>
+        <w:pStyle w:val="ListParagraph"/>
+        <w:numPr>
+          <w:ilvl w:val="0"/>
+          <w:numId w:val="16"/>
+        </w:numPr>
+        <w:rPr>
+          <w:lang w:val="en-US"/>
+        </w:rPr>
+      </w:pPr>
+      <w:r>
+        <w:rPr>
+          <w:lang w:val="en-US"/>
+        </w:rPr>
+        <w:t>Click on ‘</w:t>
+      </w:r>
+      <w:proofErr w:type="spellStart"/>
+      <w:r>
+        <w:rPr>
+          <w:lang w:val="en-US"/>
+        </w:rPr>
+        <w:t>venv</w:t>
+      </w:r>
+      <w:proofErr w:type="spellEnd"/>
+      <w:r>
+        <w:rPr>
+          <w:lang w:val="en-US"/>
+        </w:rPr>
+        <w:t>’</w:t>
+      </w:r>
+    </w:p>
+    <w:p>
+      <w:pPr>
+        <w:ind w:left="720"/>
+        <w:rPr>
+          <w:lang w:val="en-US"/>
+        </w:rPr>
+      </w:pPr>
+      <w:r>
+        <w:rPr>
+          <w:noProof/>
+          <w:lang w:val="en-US"/>
+        </w:rPr>
+        <w:drawing>
+          <wp:inline distT="0" distB="0" distL="0" distR="0" wp14:anchorId="2F182333" wp14:editId="4C0B2CC0">
+            <wp:extent cx="4363059" cy="447737"/>
+            <wp:effectExtent l="0" t="0" r="0" b="9525"/>
+            <wp:docPr id="23" name="Picture 23"/>
+            <wp:cNvGraphicFramePr>
+              <a:graphicFrameLocks xmlns:a="http://schemas.openxmlformats.org/drawingml/2006/main" noChangeAspect="1"/>
+            </wp:cNvGraphicFramePr>
+            <a:graphic xmlns:a="http://schemas.openxmlformats.org/drawingml/2006/main">
+              <a:graphicData uri="http://schemas.openxmlformats.org/drawingml/2006/picture">
+                <pic:pic xmlns:pic="http://schemas.openxmlformats.org/drawingml/2006/picture">
+                  <pic:nvPicPr>
+                    <pic:cNvPr id="1" name=""/>
+                    <pic:cNvPicPr/>
+                  </pic:nvPicPr>
+                  <pic:blipFill>
+                    <a:blip r:embed="rId24"/>
+                    <a:stretch>
+                      <a:fillRect/>
+                    </a:stretch>
+                  </pic:blipFill>
+                  <pic:spPr>
+                    <a:xfrm>
+                      <a:off x="0" y="0"/>
+                      <a:ext cx="4363059" cy="447737"/>
+                    </a:xfrm>
+                    <a:prstGeom prst="rect">
+                      <a:avLst/>
+                    </a:prstGeom>
+                  </pic:spPr>
+                </pic:pic>
+              </a:graphicData>
+            </a:graphic>
+          </wp:inline>
+        </w:drawing>
+      </w:r>
+    </w:p>
+    <w:p>
+      <w:pPr>
+        <w:pStyle w:val="ListParagraph"/>
+        <w:numPr>
+          <w:ilvl w:val="0"/>
+          <w:numId w:val="16"/>
+        </w:numPr>
+        <w:rPr>
+          <w:lang w:val="en-US"/>
+        </w:rPr>
+      </w:pPr>
+      <w:r>
+        <w:rPr>
+          <w:lang w:val="en-US"/>
+        </w:rPr>
+        <w:t>Click on the ‘Run all’ button</w:t>
+      </w:r>
+    </w:p>
+    <w:p>
+      <w:pPr>
+        <w:ind w:left="720"/>
+        <w:rPr>
+          <w:lang w:val="en-US"/>
+        </w:rPr>
+      </w:pPr>
+      <w:r>
+        <w:rPr>
+          <w:noProof/>
+          <w:lang w:val="en-US"/>
+        </w:rPr>
+        <w:drawing>
+          <wp:inline distT="0" distB="0" distL="0" distR="0" wp14:anchorId="2D3A8B5C" wp14:editId="3A01202A">
+            <wp:extent cx="1305107" cy="485843"/>
+            <wp:effectExtent l="0" t="0" r="0" b="9525"/>
+            <wp:docPr id="24" name="Picture 24"/>
+            <wp:cNvGraphicFramePr>
+              <a:graphicFrameLocks xmlns:a="http://schemas.openxmlformats.org/drawingml/2006/main" noChangeAspect="1"/>
+            </wp:cNvGraphicFramePr>
+            <a:graphic xmlns:a="http://schemas.openxmlformats.org/drawingml/2006/main">
+              <a:graphicData uri="http://schemas.openxmlformats.org/drawingml/2006/picture">
+                <pic:pic xmlns:pic="http://schemas.openxmlformats.org/drawingml/2006/picture">
+                  <pic:nvPicPr>
+                    <pic:cNvPr id="1" name=""/>
+                    <pic:cNvPicPr/>
+                  </pic:nvPicPr>
+                  <pic:blipFill>
+                    <a:blip r:embed="rId25"/>
+                    <a:stretch>
+                      <a:fillRect/>
+                    </a:stretch>
+                  </pic:blipFill>
+                  <pic:spPr>
+                    <a:xfrm>
+                      <a:off x="0" y="0"/>
                       <a:ext cx="1305107" cy="485843"/>
                     </a:xfrm>
                     <a:prstGeom prst="rect">
@@ -2640,12 +3721,14 @@
         </w:rPr>
         <w:t xml:space="preserve"> application (</w:t>
       </w:r>
+      <w:proofErr w:type="spellStart"/>
       <w:r>
         <w:rPr>
           <w:lang w:val="en-US"/>
         </w:rPr>
         <w:t>Streamlit</w:t>
       </w:r>
+      <w:proofErr w:type="spellEnd"/>
       <w:r>
         <w:rPr>
           <w:lang w:val="en-US"/>
@@ -2684,7 +3767,23 @@
           <w:color w:val="C00000"/>
           <w:lang w:val="en-US"/>
         </w:rPr>
-        <w:t>(venv/Scripts/activate)</w:t>
+        <w:t>(</w:t>
+      </w:r>
+      <w:proofErr w:type="spellStart"/>
+      <w:r>
+        <w:rPr>
+          <w:color w:val="C00000"/>
+          <w:lang w:val="en-US"/>
+        </w:rPr>
+        <w:t>venv</w:t>
+      </w:r>
+      <w:proofErr w:type="spellEnd"/>
+      <w:r>
+        <w:rPr>
+          <w:color w:val="C00000"/>
+          <w:lang w:val="en-US"/>
+        </w:rPr>
+        <w:t>/Scripts/activate)</w:t>
       </w:r>
     </w:p>
     <w:p>
@@ -2718,13 +3817,23 @@
           <w:lang w:val="en-US"/>
         </w:rPr>
       </w:pPr>
-      <w:r>
-        <w:rPr>
-          <w:b/>
-          <w:bCs/>
-          <w:lang w:val="en-US"/>
-        </w:rPr>
-        <w:t>streamlit run app.p</w:t>
+      <w:proofErr w:type="spellStart"/>
+      <w:r>
+        <w:rPr>
+          <w:b/>
+          <w:bCs/>
+          <w:lang w:val="en-US"/>
+        </w:rPr>
+        <w:t>streamlit</w:t>
+      </w:r>
+      <w:proofErr w:type="spellEnd"/>
+      <w:r>
+        <w:rPr>
+          <w:b/>
+          <w:bCs/>
+          <w:lang w:val="en-US"/>
+        </w:rPr>
+        <w:t xml:space="preserve"> run app.p</w:t>
       </w:r>
       <w:r>
         <w:rPr>
@@ -2784,7 +3893,7 @@
       </w:pPr>
     </w:p>
     <w:sectPr>
-      <w:headerReference w:type="default" r:id="rId24"/>
+      <w:headerReference w:type="default" r:id="rId26"/>
       <w:pgSz w:w="11906" w:h="16838"/>
       <w:pgMar w:top="1440" w:right="1440" w:bottom="1440" w:left="1440" w:header="708" w:footer="708" w:gutter="0"/>
       <w:cols w:space="708"/>
@@ -2862,8 +3971,18 @@
         <w:szCs w:val="28"/>
         <w:lang w:val="en-US"/>
       </w:rPr>
-      <w:t>Instruction Manual – Jonathan &lt;&gt; AiGENThix</w:t>
+      <w:t xml:space="preserve">Instruction Manual – Jonathan &lt;&gt; </w:t>
     </w:r>
+    <w:proofErr w:type="spellStart"/>
+    <w:r>
+      <w:rPr>
+        <w:sz w:val="28"/>
+        <w:szCs w:val="28"/>
+        <w:lang w:val="en-US"/>
+      </w:rPr>
+      <w:t>AiGENThix</w:t>
+    </w:r>
+    <w:proofErr w:type="spellEnd"/>
   </w:p>
 </w:hdr>
 </file>
@@ -3074,7 +4193,7 @@
   <w:abstractNum w:abstractNumId="2" w15:restartNumberingAfterBreak="0">
     <w:nsid w:val="135B41C9"/>
     <w:multiLevelType w:val="hybridMultilevel"/>
-    <w:tmpl w:val="0CD47024"/>
+    <w:tmpl w:val="BA6079BC"/>
     <w:lvl w:ilvl="0" w:tplc="FFFFFFFF">
       <w:start w:val="1"/>
       <w:numFmt w:val="decimal"/>
@@ -3087,7 +4206,7 @@
         <w:rFonts w:hint="default"/>
       </w:rPr>
     </w:lvl>
-    <w:lvl w:ilvl="1" w:tplc="40090019" w:tentative="1">
+    <w:lvl w:ilvl="1" w:tplc="40090019">
       <w:start w:val="1"/>
       <w:numFmt w:val="lowerLetter"/>
       <w:lvlText w:val="%2."/>
@@ -3096,14 +4215,17 @@
         <w:ind w:left="1440" w:hanging="360"/>
       </w:pPr>
     </w:lvl>
-    <w:lvl w:ilvl="2" w:tplc="4009001B" w:tentative="1">
-      <w:start w:val="1"/>
-      <w:numFmt w:val="lowerRoman"/>
-      <w:lvlText w:val="%3."/>
-      <w:lvlJc w:val="right"/>
-      <w:pPr>
-        <w:ind w:left="2160" w:hanging="180"/>
-      </w:pPr>
+    <w:lvl w:ilvl="2" w:tplc="7FF0A226">
+      <w:start w:val="3"/>
+      <w:numFmt w:val="lowerLetter"/>
+      <w:lvlText w:val="%3)"/>
+      <w:lvlJc w:val="left"/>
+      <w:pPr>
+        <w:ind w:left="2340" w:hanging="360"/>
+      </w:pPr>
+      <w:rPr>
+        <w:rFonts w:hint="default"/>
+      </w:rPr>
     </w:lvl>
     <w:lvl w:ilvl="3" w:tplc="4009000F" w:tentative="1">
       <w:start w:val="1"/>
@@ -3921,6 +5043,155 @@
     </w:lvl>
   </w:abstractNum>
   <w:abstractNum w:abstractNumId="11" w15:restartNumberingAfterBreak="0">
+    <w:nsid w:val="4EDC0BC7"/>
+    <w:multiLevelType w:val="multilevel"/>
+    <w:tmpl w:val="FD6821B4"/>
+    <w:lvl w:ilvl="0">
+      <w:start w:val="1"/>
+      <w:numFmt w:val="bullet"/>
+      <w:lvlText w:val=""/>
+      <w:lvlJc w:val="left"/>
+      <w:pPr>
+        <w:tabs>
+          <w:tab w:val="num" w:pos="720"/>
+        </w:tabs>
+        <w:ind w:left="720" w:hanging="360"/>
+      </w:pPr>
+      <w:rPr>
+        <w:rFonts w:ascii="Symbol" w:hAnsi="Symbol" w:hint="default"/>
+        <w:sz w:val="20"/>
+      </w:rPr>
+    </w:lvl>
+    <w:lvl w:ilvl="1" w:tentative="1">
+      <w:start w:val="1"/>
+      <w:numFmt w:val="bullet"/>
+      <w:lvlText w:val=""/>
+      <w:lvlJc w:val="left"/>
+      <w:pPr>
+        <w:tabs>
+          <w:tab w:val="num" w:pos="1440"/>
+        </w:tabs>
+        <w:ind w:left="1440" w:hanging="360"/>
+      </w:pPr>
+      <w:rPr>
+        <w:rFonts w:ascii="Symbol" w:hAnsi="Symbol" w:hint="default"/>
+        <w:sz w:val="20"/>
+      </w:rPr>
+    </w:lvl>
+    <w:lvl w:ilvl="2" w:tentative="1">
+      <w:start w:val="1"/>
+      <w:numFmt w:val="bullet"/>
+      <w:lvlText w:val=""/>
+      <w:lvlJc w:val="left"/>
+      <w:pPr>
+        <w:tabs>
+          <w:tab w:val="num" w:pos="2160"/>
+        </w:tabs>
+        <w:ind w:left="2160" w:hanging="360"/>
+      </w:pPr>
+      <w:rPr>
+        <w:rFonts w:ascii="Symbol" w:hAnsi="Symbol" w:hint="default"/>
+        <w:sz w:val="20"/>
+      </w:rPr>
+    </w:lvl>
+    <w:lvl w:ilvl="3" w:tentative="1">
+      <w:start w:val="1"/>
+      <w:numFmt w:val="bullet"/>
+      <w:lvlText w:val=""/>
+      <w:lvlJc w:val="left"/>
+      <w:pPr>
+        <w:tabs>
+          <w:tab w:val="num" w:pos="2880"/>
+        </w:tabs>
+        <w:ind w:left="2880" w:hanging="360"/>
+      </w:pPr>
+      <w:rPr>
+        <w:rFonts w:ascii="Symbol" w:hAnsi="Symbol" w:hint="default"/>
+        <w:sz w:val="20"/>
+      </w:rPr>
+    </w:lvl>
+    <w:lvl w:ilvl="4" w:tentative="1">
+      <w:start w:val="1"/>
+      <w:numFmt w:val="bullet"/>
+      <w:lvlText w:val=""/>
+      <w:lvlJc w:val="left"/>
+      <w:pPr>
+        <w:tabs>
+          <w:tab w:val="num" w:pos="3600"/>
+        </w:tabs>
+        <w:ind w:left="3600" w:hanging="360"/>
+      </w:pPr>
+      <w:rPr>
+        <w:rFonts w:ascii="Symbol" w:hAnsi="Symbol" w:hint="default"/>
+        <w:sz w:val="20"/>
+      </w:rPr>
+    </w:lvl>
+    <w:lvl w:ilvl="5" w:tentative="1">
+      <w:start w:val="1"/>
+      <w:numFmt w:val="bullet"/>
+      <w:lvlText w:val=""/>
+      <w:lvlJc w:val="left"/>
+      <w:pPr>
+        <w:tabs>
+          <w:tab w:val="num" w:pos="4320"/>
+        </w:tabs>
+        <w:ind w:left="4320" w:hanging="360"/>
+      </w:pPr>
+      <w:rPr>
+        <w:rFonts w:ascii="Symbol" w:hAnsi="Symbol" w:hint="default"/>
+        <w:sz w:val="20"/>
+      </w:rPr>
+    </w:lvl>
+    <w:lvl w:ilvl="6" w:tentative="1">
+      <w:start w:val="1"/>
+      <w:numFmt w:val="bullet"/>
+      <w:lvlText w:val=""/>
+      <w:lvlJc w:val="left"/>
+      <w:pPr>
+        <w:tabs>
+          <w:tab w:val="num" w:pos="5040"/>
+        </w:tabs>
+        <w:ind w:left="5040" w:hanging="360"/>
+      </w:pPr>
+      <w:rPr>
+        <w:rFonts w:ascii="Symbol" w:hAnsi="Symbol" w:hint="default"/>
+        <w:sz w:val="20"/>
+      </w:rPr>
+    </w:lvl>
+    <w:lvl w:ilvl="7" w:tentative="1">
+      <w:start w:val="1"/>
+      <w:numFmt w:val="bullet"/>
+      <w:lvlText w:val=""/>
+      <w:lvlJc w:val="left"/>
+      <w:pPr>
+        <w:tabs>
+          <w:tab w:val="num" w:pos="5760"/>
+        </w:tabs>
+        <w:ind w:left="5760" w:hanging="360"/>
+      </w:pPr>
+      <w:rPr>
+        <w:rFonts w:ascii="Symbol" w:hAnsi="Symbol" w:hint="default"/>
+        <w:sz w:val="20"/>
+      </w:rPr>
+    </w:lvl>
+    <w:lvl w:ilvl="8" w:tentative="1">
+      <w:start w:val="1"/>
+      <w:numFmt w:val="bullet"/>
+      <w:lvlText w:val=""/>
+      <w:lvlJc w:val="left"/>
+      <w:pPr>
+        <w:tabs>
+          <w:tab w:val="num" w:pos="6480"/>
+        </w:tabs>
+        <w:ind w:left="6480" w:hanging="360"/>
+      </w:pPr>
+      <w:rPr>
+        <w:rFonts w:ascii="Symbol" w:hAnsi="Symbol" w:hint="default"/>
+        <w:sz w:val="20"/>
+      </w:rPr>
+    </w:lvl>
+  </w:abstractNum>
+  <w:abstractNum w:abstractNumId="12" w15:restartNumberingAfterBreak="0">
     <w:nsid w:val="505E6F26"/>
     <w:multiLevelType w:val="hybridMultilevel"/>
     <w:tmpl w:val="8CF62F48"/>
@@ -4033,7 +5304,7 @@
       </w:rPr>
     </w:lvl>
   </w:abstractNum>
-  <w:abstractNum w:abstractNumId="12" w15:restartNumberingAfterBreak="0">
+  <w:abstractNum w:abstractNumId="13" w15:restartNumberingAfterBreak="0">
     <w:nsid w:val="5427334C"/>
     <w:multiLevelType w:val="hybridMultilevel"/>
     <w:tmpl w:val="C16E44FC"/>
@@ -4122,7 +5393,156 @@
       </w:pPr>
     </w:lvl>
   </w:abstractNum>
-  <w:abstractNum w:abstractNumId="13" w15:restartNumberingAfterBreak="0">
+  <w:abstractNum w:abstractNumId="14" w15:restartNumberingAfterBreak="0">
+    <w:nsid w:val="57C15D48"/>
+    <w:multiLevelType w:val="multilevel"/>
+    <w:tmpl w:val="C7C67890"/>
+    <w:lvl w:ilvl="0">
+      <w:start w:val="1"/>
+      <w:numFmt w:val="bullet"/>
+      <w:lvlText w:val=""/>
+      <w:lvlJc w:val="left"/>
+      <w:pPr>
+        <w:tabs>
+          <w:tab w:val="num" w:pos="720"/>
+        </w:tabs>
+        <w:ind w:left="720" w:hanging="360"/>
+      </w:pPr>
+      <w:rPr>
+        <w:rFonts w:ascii="Symbol" w:hAnsi="Symbol" w:hint="default"/>
+        <w:sz w:val="20"/>
+      </w:rPr>
+    </w:lvl>
+    <w:lvl w:ilvl="1" w:tentative="1">
+      <w:start w:val="1"/>
+      <w:numFmt w:val="bullet"/>
+      <w:lvlText w:val=""/>
+      <w:lvlJc w:val="left"/>
+      <w:pPr>
+        <w:tabs>
+          <w:tab w:val="num" w:pos="1440"/>
+        </w:tabs>
+        <w:ind w:left="1440" w:hanging="360"/>
+      </w:pPr>
+      <w:rPr>
+        <w:rFonts w:ascii="Symbol" w:hAnsi="Symbol" w:hint="default"/>
+        <w:sz w:val="20"/>
+      </w:rPr>
+    </w:lvl>
+    <w:lvl w:ilvl="2" w:tentative="1">
+      <w:start w:val="1"/>
+      <w:numFmt w:val="bullet"/>
+      <w:lvlText w:val=""/>
+      <w:lvlJc w:val="left"/>
+      <w:pPr>
+        <w:tabs>
+          <w:tab w:val="num" w:pos="2160"/>
+        </w:tabs>
+        <w:ind w:left="2160" w:hanging="360"/>
+      </w:pPr>
+      <w:rPr>
+        <w:rFonts w:ascii="Symbol" w:hAnsi="Symbol" w:hint="default"/>
+        <w:sz w:val="20"/>
+      </w:rPr>
+    </w:lvl>
+    <w:lvl w:ilvl="3" w:tentative="1">
+      <w:start w:val="1"/>
+      <w:numFmt w:val="bullet"/>
+      <w:lvlText w:val=""/>
+      <w:lvlJc w:val="left"/>
+      <w:pPr>
+        <w:tabs>
+          <w:tab w:val="num" w:pos="2880"/>
+        </w:tabs>
+        <w:ind w:left="2880" w:hanging="360"/>
+      </w:pPr>
+      <w:rPr>
+        <w:rFonts w:ascii="Symbol" w:hAnsi="Symbol" w:hint="default"/>
+        <w:sz w:val="20"/>
+      </w:rPr>
+    </w:lvl>
+    <w:lvl w:ilvl="4" w:tentative="1">
+      <w:start w:val="1"/>
+      <w:numFmt w:val="bullet"/>
+      <w:lvlText w:val=""/>
+      <w:lvlJc w:val="left"/>
+      <w:pPr>
+        <w:tabs>
+          <w:tab w:val="num" w:pos="3600"/>
+        </w:tabs>
+        <w:ind w:left="3600" w:hanging="360"/>
+      </w:pPr>
+      <w:rPr>
+        <w:rFonts w:ascii="Symbol" w:hAnsi="Symbol" w:hint="default"/>
+        <w:sz w:val="20"/>
+      </w:rPr>
+    </w:lvl>
+    <w:lvl w:ilvl="5" w:tentative="1">
+      <w:start w:val="1"/>
+      <w:numFmt w:val="bullet"/>
+      <w:lvlText w:val=""/>
+      <w:lvlJc w:val="left"/>
+      <w:pPr>
+        <w:tabs>
+          <w:tab w:val="num" w:pos="4320"/>
+        </w:tabs>
+        <w:ind w:left="4320" w:hanging="360"/>
+      </w:pPr>
+      <w:rPr>
+        <w:rFonts w:ascii="Symbol" w:hAnsi="Symbol" w:hint="default"/>
+        <w:sz w:val="20"/>
+      </w:rPr>
+    </w:lvl>
+    <w:lvl w:ilvl="6" w:tentative="1">
+      <w:start w:val="1"/>
+      <w:numFmt w:val="bullet"/>
+      <w:lvlText w:val=""/>
+      <w:lvlJc w:val="left"/>
+      <w:pPr>
+        <w:tabs>
+          <w:tab w:val="num" w:pos="5040"/>
+        </w:tabs>
+        <w:ind w:left="5040" w:hanging="360"/>
+      </w:pPr>
+      <w:rPr>
+        <w:rFonts w:ascii="Symbol" w:hAnsi="Symbol" w:hint="default"/>
+        <w:sz w:val="20"/>
+      </w:rPr>
+    </w:lvl>
+    <w:lvl w:ilvl="7" w:tentative="1">
+      <w:start w:val="1"/>
+      <w:numFmt w:val="bullet"/>
+      <w:lvlText w:val=""/>
+      <w:lvlJc w:val="left"/>
+      <w:pPr>
+        <w:tabs>
+          <w:tab w:val="num" w:pos="5760"/>
+        </w:tabs>
+        <w:ind w:left="5760" w:hanging="360"/>
+      </w:pPr>
+      <w:rPr>
+        <w:rFonts w:ascii="Symbol" w:hAnsi="Symbol" w:hint="default"/>
+        <w:sz w:val="20"/>
+      </w:rPr>
+    </w:lvl>
+    <w:lvl w:ilvl="8" w:tentative="1">
+      <w:start w:val="1"/>
+      <w:numFmt w:val="bullet"/>
+      <w:lvlText w:val=""/>
+      <w:lvlJc w:val="left"/>
+      <w:pPr>
+        <w:tabs>
+          <w:tab w:val="num" w:pos="6480"/>
+        </w:tabs>
+        <w:ind w:left="6480" w:hanging="360"/>
+      </w:pPr>
+      <w:rPr>
+        <w:rFonts w:ascii="Symbol" w:hAnsi="Symbol" w:hint="default"/>
+        <w:sz w:val="20"/>
+      </w:rPr>
+    </w:lvl>
+  </w:abstractNum>
+  <w:abstractNum w:abstractNumId="15" w15:restartNumberingAfterBreak="0">
     <w:nsid w:val="59991042"/>
     <w:multiLevelType w:val="hybridMultilevel"/>
     <w:tmpl w:val="AC5834E0"/>
@@ -4235,7 +5655,7 @@
       </w:rPr>
     </w:lvl>
   </w:abstractNum>
-  <w:abstractNum w:abstractNumId="14" w15:restartNumberingAfterBreak="0">
+  <w:abstractNum w:abstractNumId="16" w15:restartNumberingAfterBreak="0">
     <w:nsid w:val="657337A4"/>
     <w:multiLevelType w:val="hybridMultilevel"/>
     <w:tmpl w:val="780CCD60"/>
@@ -4324,7 +5744,245 @@
       </w:pPr>
     </w:lvl>
   </w:abstractNum>
-  <w:abstractNum w:abstractNumId="15" w15:restartNumberingAfterBreak="0">
+  <w:abstractNum w:abstractNumId="17" w15:restartNumberingAfterBreak="0">
+    <w:nsid w:val="6A823B34"/>
+    <w:multiLevelType w:val="multilevel"/>
+    <w:tmpl w:val="1528EE9A"/>
+    <w:lvl w:ilvl="0">
+      <w:start w:val="1"/>
+      <w:numFmt w:val="bullet"/>
+      <w:lvlText w:val=""/>
+      <w:lvlJc w:val="left"/>
+      <w:pPr>
+        <w:tabs>
+          <w:tab w:val="num" w:pos="720"/>
+        </w:tabs>
+        <w:ind w:left="720" w:hanging="360"/>
+      </w:pPr>
+      <w:rPr>
+        <w:rFonts w:ascii="Symbol" w:hAnsi="Symbol" w:hint="default"/>
+        <w:sz w:val="20"/>
+      </w:rPr>
+    </w:lvl>
+    <w:lvl w:ilvl="1" w:tentative="1">
+      <w:start w:val="1"/>
+      <w:numFmt w:val="bullet"/>
+      <w:lvlText w:val=""/>
+      <w:lvlJc w:val="left"/>
+      <w:pPr>
+        <w:tabs>
+          <w:tab w:val="num" w:pos="1440"/>
+        </w:tabs>
+        <w:ind w:left="1440" w:hanging="360"/>
+      </w:pPr>
+      <w:rPr>
+        <w:rFonts w:ascii="Symbol" w:hAnsi="Symbol" w:hint="default"/>
+        <w:sz w:val="20"/>
+      </w:rPr>
+    </w:lvl>
+    <w:lvl w:ilvl="2" w:tentative="1">
+      <w:start w:val="1"/>
+      <w:numFmt w:val="bullet"/>
+      <w:lvlText w:val=""/>
+      <w:lvlJc w:val="left"/>
+      <w:pPr>
+        <w:tabs>
+          <w:tab w:val="num" w:pos="2160"/>
+        </w:tabs>
+        <w:ind w:left="2160" w:hanging="360"/>
+      </w:pPr>
+      <w:rPr>
+        <w:rFonts w:ascii="Symbol" w:hAnsi="Symbol" w:hint="default"/>
+        <w:sz w:val="20"/>
+      </w:rPr>
+    </w:lvl>
+    <w:lvl w:ilvl="3" w:tentative="1">
+      <w:start w:val="1"/>
+      <w:numFmt w:val="bullet"/>
+      <w:lvlText w:val=""/>
+      <w:lvlJc w:val="left"/>
+      <w:pPr>
+        <w:tabs>
+          <w:tab w:val="num" w:pos="2880"/>
+        </w:tabs>
+        <w:ind w:left="2880" w:hanging="360"/>
+      </w:pPr>
+      <w:rPr>
+        <w:rFonts w:ascii="Symbol" w:hAnsi="Symbol" w:hint="default"/>
+        <w:sz w:val="20"/>
+      </w:rPr>
+    </w:lvl>
+    <w:lvl w:ilvl="4" w:tentative="1">
+      <w:start w:val="1"/>
+      <w:numFmt w:val="bullet"/>
+      <w:lvlText w:val=""/>
+      <w:lvlJc w:val="left"/>
+      <w:pPr>
+        <w:tabs>
+          <w:tab w:val="num" w:pos="3600"/>
+        </w:tabs>
+        <w:ind w:left="3600" w:hanging="360"/>
+      </w:pPr>
+      <w:rPr>
+        <w:rFonts w:ascii="Symbol" w:hAnsi="Symbol" w:hint="default"/>
+        <w:sz w:val="20"/>
+      </w:rPr>
+    </w:lvl>
+    <w:lvl w:ilvl="5" w:tentative="1">
+      <w:start w:val="1"/>
+      <w:numFmt w:val="bullet"/>
+      <w:lvlText w:val=""/>
+      <w:lvlJc w:val="left"/>
+      <w:pPr>
+        <w:tabs>
+          <w:tab w:val="num" w:pos="4320"/>
+        </w:tabs>
+        <w:ind w:left="4320" w:hanging="360"/>
+      </w:pPr>
+      <w:rPr>
+        <w:rFonts w:ascii="Symbol" w:hAnsi="Symbol" w:hint="default"/>
+        <w:sz w:val="20"/>
+      </w:rPr>
+    </w:lvl>
+    <w:lvl w:ilvl="6" w:tentative="1">
+      <w:start w:val="1"/>
+      <w:numFmt w:val="bullet"/>
+      <w:lvlText w:val=""/>
+      <w:lvlJc w:val="left"/>
+      <w:pPr>
+        <w:tabs>
+          <w:tab w:val="num" w:pos="5040"/>
+        </w:tabs>
+        <w:ind w:left="5040" w:hanging="360"/>
+      </w:pPr>
+      <w:rPr>
+        <w:rFonts w:ascii="Symbol" w:hAnsi="Symbol" w:hint="default"/>
+        <w:sz w:val="20"/>
+      </w:rPr>
+    </w:lvl>
+    <w:lvl w:ilvl="7" w:tentative="1">
+      <w:start w:val="1"/>
+      <w:numFmt w:val="bullet"/>
+      <w:lvlText w:val=""/>
+      <w:lvlJc w:val="left"/>
+      <w:pPr>
+        <w:tabs>
+          <w:tab w:val="num" w:pos="5760"/>
+        </w:tabs>
+        <w:ind w:left="5760" w:hanging="360"/>
+      </w:pPr>
+      <w:rPr>
+        <w:rFonts w:ascii="Symbol" w:hAnsi="Symbol" w:hint="default"/>
+        <w:sz w:val="20"/>
+      </w:rPr>
+    </w:lvl>
+    <w:lvl w:ilvl="8" w:tentative="1">
+      <w:start w:val="1"/>
+      <w:numFmt w:val="bullet"/>
+      <w:lvlText w:val=""/>
+      <w:lvlJc w:val="left"/>
+      <w:pPr>
+        <w:tabs>
+          <w:tab w:val="num" w:pos="6480"/>
+        </w:tabs>
+        <w:ind w:left="6480" w:hanging="360"/>
+      </w:pPr>
+      <w:rPr>
+        <w:rFonts w:ascii="Symbol" w:hAnsi="Symbol" w:hint="default"/>
+        <w:sz w:val="20"/>
+      </w:rPr>
+    </w:lvl>
+  </w:abstractNum>
+  <w:abstractNum w:abstractNumId="18" w15:restartNumberingAfterBreak="0">
+    <w:nsid w:val="6BC24F0E"/>
+    <w:multiLevelType w:val="hybridMultilevel"/>
+    <w:tmpl w:val="58A8905C"/>
+    <w:lvl w:ilvl="0" w:tplc="40090017">
+      <w:start w:val="1"/>
+      <w:numFmt w:val="lowerLetter"/>
+      <w:lvlText w:val="%1)"/>
+      <w:lvlJc w:val="left"/>
+      <w:pPr>
+        <w:ind w:left="1440" w:hanging="360"/>
+      </w:pPr>
+      <w:rPr>
+        <w:rFonts w:hint="default"/>
+      </w:rPr>
+    </w:lvl>
+    <w:lvl w:ilvl="1" w:tplc="40090019" w:tentative="1">
+      <w:start w:val="1"/>
+      <w:numFmt w:val="lowerLetter"/>
+      <w:lvlText w:val="%2."/>
+      <w:lvlJc w:val="left"/>
+      <w:pPr>
+        <w:ind w:left="1800" w:hanging="360"/>
+      </w:pPr>
+    </w:lvl>
+    <w:lvl w:ilvl="2" w:tplc="4009001B" w:tentative="1">
+      <w:start w:val="1"/>
+      <w:numFmt w:val="lowerRoman"/>
+      <w:lvlText w:val="%3."/>
+      <w:lvlJc w:val="right"/>
+      <w:pPr>
+        <w:ind w:left="2520" w:hanging="180"/>
+      </w:pPr>
+    </w:lvl>
+    <w:lvl w:ilvl="3" w:tplc="4009000F" w:tentative="1">
+      <w:start w:val="1"/>
+      <w:numFmt w:val="decimal"/>
+      <w:lvlText w:val="%4."/>
+      <w:lvlJc w:val="left"/>
+      <w:pPr>
+        <w:ind w:left="3240" w:hanging="360"/>
+      </w:pPr>
+    </w:lvl>
+    <w:lvl w:ilvl="4" w:tplc="40090019" w:tentative="1">
+      <w:start w:val="1"/>
+      <w:numFmt w:val="lowerLetter"/>
+      <w:lvlText w:val="%5."/>
+      <w:lvlJc w:val="left"/>
+      <w:pPr>
+        <w:ind w:left="3960" w:hanging="360"/>
+      </w:pPr>
+    </w:lvl>
+    <w:lvl w:ilvl="5" w:tplc="4009001B" w:tentative="1">
+      <w:start w:val="1"/>
+      <w:numFmt w:val="lowerRoman"/>
+      <w:lvlText w:val="%6."/>
+      <w:lvlJc w:val="right"/>
+      <w:pPr>
+        <w:ind w:left="4680" w:hanging="180"/>
+      </w:pPr>
+    </w:lvl>
+    <w:lvl w:ilvl="6" w:tplc="4009000F" w:tentative="1">
+      <w:start w:val="1"/>
+      <w:numFmt w:val="decimal"/>
+      <w:lvlText w:val="%7."/>
+      <w:lvlJc w:val="left"/>
+      <w:pPr>
+        <w:ind w:left="5400" w:hanging="360"/>
+      </w:pPr>
+    </w:lvl>
+    <w:lvl w:ilvl="7" w:tplc="40090019" w:tentative="1">
+      <w:start w:val="1"/>
+      <w:numFmt w:val="lowerLetter"/>
+      <w:lvlText w:val="%8."/>
+      <w:lvlJc w:val="left"/>
+      <w:pPr>
+        <w:ind w:left="6120" w:hanging="360"/>
+      </w:pPr>
+    </w:lvl>
+    <w:lvl w:ilvl="8" w:tplc="4009001B" w:tentative="1">
+      <w:start w:val="1"/>
+      <w:numFmt w:val="lowerRoman"/>
+      <w:lvlText w:val="%9."/>
+      <w:lvlJc w:val="right"/>
+      <w:pPr>
+        <w:ind w:left="6840" w:hanging="180"/>
+      </w:pPr>
+    </w:lvl>
+  </w:abstractNum>
+  <w:abstractNum w:abstractNumId="19" w15:restartNumberingAfterBreak="0">
     <w:nsid w:val="6F0435C6"/>
     <w:multiLevelType w:val="hybridMultilevel"/>
     <w:tmpl w:val="43DEFA7A"/>
@@ -4437,7 +6095,7 @@
       </w:rPr>
     </w:lvl>
   </w:abstractNum>
-  <w:abstractNum w:abstractNumId="16" w15:restartNumberingAfterBreak="0">
+  <w:abstractNum w:abstractNumId="20" w15:restartNumberingAfterBreak="0">
     <w:nsid w:val="6F4D2B8B"/>
     <w:multiLevelType w:val="hybridMultilevel"/>
     <w:tmpl w:val="C16E44FC"/>
@@ -4524,13 +6182,251 @@
       <w:pPr>
         <w:ind w:left="6840" w:hanging="180"/>
       </w:pPr>
+    </w:lvl>
+  </w:abstractNum>
+  <w:abstractNum w:abstractNumId="21" w15:restartNumberingAfterBreak="0">
+    <w:nsid w:val="6FFF5036"/>
+    <w:multiLevelType w:val="hybridMultilevel"/>
+    <w:tmpl w:val="D7A468C4"/>
+    <w:lvl w:ilvl="0" w:tplc="FFFFFFFF">
+      <w:start w:val="1"/>
+      <w:numFmt w:val="decimal"/>
+      <w:lvlText w:val="%1."/>
+      <w:lvlJc w:val="left"/>
+      <w:pPr>
+        <w:ind w:left="1800" w:hanging="360"/>
+      </w:pPr>
+      <w:rPr>
+        <w:rFonts w:hint="default"/>
+      </w:rPr>
+    </w:lvl>
+    <w:lvl w:ilvl="1" w:tplc="40090019" w:tentative="1">
+      <w:start w:val="1"/>
+      <w:numFmt w:val="lowerLetter"/>
+      <w:lvlText w:val="%2."/>
+      <w:lvlJc w:val="left"/>
+      <w:pPr>
+        <w:ind w:left="2160" w:hanging="360"/>
+      </w:pPr>
+    </w:lvl>
+    <w:lvl w:ilvl="2" w:tplc="4009001B" w:tentative="1">
+      <w:start w:val="1"/>
+      <w:numFmt w:val="lowerRoman"/>
+      <w:lvlText w:val="%3."/>
+      <w:lvlJc w:val="right"/>
+      <w:pPr>
+        <w:ind w:left="2880" w:hanging="180"/>
+      </w:pPr>
+    </w:lvl>
+    <w:lvl w:ilvl="3" w:tplc="4009000F" w:tentative="1">
+      <w:start w:val="1"/>
+      <w:numFmt w:val="decimal"/>
+      <w:lvlText w:val="%4."/>
+      <w:lvlJc w:val="left"/>
+      <w:pPr>
+        <w:ind w:left="3600" w:hanging="360"/>
+      </w:pPr>
+    </w:lvl>
+    <w:lvl w:ilvl="4" w:tplc="40090019" w:tentative="1">
+      <w:start w:val="1"/>
+      <w:numFmt w:val="lowerLetter"/>
+      <w:lvlText w:val="%5."/>
+      <w:lvlJc w:val="left"/>
+      <w:pPr>
+        <w:ind w:left="4320" w:hanging="360"/>
+      </w:pPr>
+    </w:lvl>
+    <w:lvl w:ilvl="5" w:tplc="4009001B" w:tentative="1">
+      <w:start w:val="1"/>
+      <w:numFmt w:val="lowerRoman"/>
+      <w:lvlText w:val="%6."/>
+      <w:lvlJc w:val="right"/>
+      <w:pPr>
+        <w:ind w:left="5040" w:hanging="180"/>
+      </w:pPr>
+    </w:lvl>
+    <w:lvl w:ilvl="6" w:tplc="4009000F" w:tentative="1">
+      <w:start w:val="1"/>
+      <w:numFmt w:val="decimal"/>
+      <w:lvlText w:val="%7."/>
+      <w:lvlJc w:val="left"/>
+      <w:pPr>
+        <w:ind w:left="5760" w:hanging="360"/>
+      </w:pPr>
+    </w:lvl>
+    <w:lvl w:ilvl="7" w:tplc="40090019" w:tentative="1">
+      <w:start w:val="1"/>
+      <w:numFmt w:val="lowerLetter"/>
+      <w:lvlText w:val="%8."/>
+      <w:lvlJc w:val="left"/>
+      <w:pPr>
+        <w:ind w:left="6480" w:hanging="360"/>
+      </w:pPr>
+    </w:lvl>
+    <w:lvl w:ilvl="8" w:tplc="4009001B" w:tentative="1">
+      <w:start w:val="1"/>
+      <w:numFmt w:val="lowerRoman"/>
+      <w:lvlText w:val="%9."/>
+      <w:lvlJc w:val="right"/>
+      <w:pPr>
+        <w:ind w:left="7200" w:hanging="180"/>
+      </w:pPr>
+    </w:lvl>
+  </w:abstractNum>
+  <w:abstractNum w:abstractNumId="22" w15:restartNumberingAfterBreak="0">
+    <w:nsid w:val="7E902C26"/>
+    <w:multiLevelType w:val="multilevel"/>
+    <w:tmpl w:val="EB2A4B16"/>
+    <w:lvl w:ilvl="0">
+      <w:start w:val="1"/>
+      <w:numFmt w:val="bullet"/>
+      <w:lvlText w:val=""/>
+      <w:lvlJc w:val="left"/>
+      <w:pPr>
+        <w:tabs>
+          <w:tab w:val="num" w:pos="720"/>
+        </w:tabs>
+        <w:ind w:left="720" w:hanging="360"/>
+      </w:pPr>
+      <w:rPr>
+        <w:rFonts w:ascii="Symbol" w:hAnsi="Symbol" w:hint="default"/>
+        <w:sz w:val="20"/>
+      </w:rPr>
+    </w:lvl>
+    <w:lvl w:ilvl="1" w:tentative="1">
+      <w:start w:val="1"/>
+      <w:numFmt w:val="bullet"/>
+      <w:lvlText w:val=""/>
+      <w:lvlJc w:val="left"/>
+      <w:pPr>
+        <w:tabs>
+          <w:tab w:val="num" w:pos="1440"/>
+        </w:tabs>
+        <w:ind w:left="1440" w:hanging="360"/>
+      </w:pPr>
+      <w:rPr>
+        <w:rFonts w:ascii="Symbol" w:hAnsi="Symbol" w:hint="default"/>
+        <w:sz w:val="20"/>
+      </w:rPr>
+    </w:lvl>
+    <w:lvl w:ilvl="2" w:tentative="1">
+      <w:start w:val="1"/>
+      <w:numFmt w:val="bullet"/>
+      <w:lvlText w:val=""/>
+      <w:lvlJc w:val="left"/>
+      <w:pPr>
+        <w:tabs>
+          <w:tab w:val="num" w:pos="2160"/>
+        </w:tabs>
+        <w:ind w:left="2160" w:hanging="360"/>
+      </w:pPr>
+      <w:rPr>
+        <w:rFonts w:ascii="Symbol" w:hAnsi="Symbol" w:hint="default"/>
+        <w:sz w:val="20"/>
+      </w:rPr>
+    </w:lvl>
+    <w:lvl w:ilvl="3" w:tentative="1">
+      <w:start w:val="1"/>
+      <w:numFmt w:val="bullet"/>
+      <w:lvlText w:val=""/>
+      <w:lvlJc w:val="left"/>
+      <w:pPr>
+        <w:tabs>
+          <w:tab w:val="num" w:pos="2880"/>
+        </w:tabs>
+        <w:ind w:left="2880" w:hanging="360"/>
+      </w:pPr>
+      <w:rPr>
+        <w:rFonts w:ascii="Symbol" w:hAnsi="Symbol" w:hint="default"/>
+        <w:sz w:val="20"/>
+      </w:rPr>
+    </w:lvl>
+    <w:lvl w:ilvl="4" w:tentative="1">
+      <w:start w:val="1"/>
+      <w:numFmt w:val="bullet"/>
+      <w:lvlText w:val=""/>
+      <w:lvlJc w:val="left"/>
+      <w:pPr>
+        <w:tabs>
+          <w:tab w:val="num" w:pos="3600"/>
+        </w:tabs>
+        <w:ind w:left="3600" w:hanging="360"/>
+      </w:pPr>
+      <w:rPr>
+        <w:rFonts w:ascii="Symbol" w:hAnsi="Symbol" w:hint="default"/>
+        <w:sz w:val="20"/>
+      </w:rPr>
+    </w:lvl>
+    <w:lvl w:ilvl="5" w:tentative="1">
+      <w:start w:val="1"/>
+      <w:numFmt w:val="bullet"/>
+      <w:lvlText w:val=""/>
+      <w:lvlJc w:val="left"/>
+      <w:pPr>
+        <w:tabs>
+          <w:tab w:val="num" w:pos="4320"/>
+        </w:tabs>
+        <w:ind w:left="4320" w:hanging="360"/>
+      </w:pPr>
+      <w:rPr>
+        <w:rFonts w:ascii="Symbol" w:hAnsi="Symbol" w:hint="default"/>
+        <w:sz w:val="20"/>
+      </w:rPr>
+    </w:lvl>
+    <w:lvl w:ilvl="6" w:tentative="1">
+      <w:start w:val="1"/>
+      <w:numFmt w:val="bullet"/>
+      <w:lvlText w:val=""/>
+      <w:lvlJc w:val="left"/>
+      <w:pPr>
+        <w:tabs>
+          <w:tab w:val="num" w:pos="5040"/>
+        </w:tabs>
+        <w:ind w:left="5040" w:hanging="360"/>
+      </w:pPr>
+      <w:rPr>
+        <w:rFonts w:ascii="Symbol" w:hAnsi="Symbol" w:hint="default"/>
+        <w:sz w:val="20"/>
+      </w:rPr>
+    </w:lvl>
+    <w:lvl w:ilvl="7" w:tentative="1">
+      <w:start w:val="1"/>
+      <w:numFmt w:val="bullet"/>
+      <w:lvlText w:val=""/>
+      <w:lvlJc w:val="left"/>
+      <w:pPr>
+        <w:tabs>
+          <w:tab w:val="num" w:pos="5760"/>
+        </w:tabs>
+        <w:ind w:left="5760" w:hanging="360"/>
+      </w:pPr>
+      <w:rPr>
+        <w:rFonts w:ascii="Symbol" w:hAnsi="Symbol" w:hint="default"/>
+        <w:sz w:val="20"/>
+      </w:rPr>
+    </w:lvl>
+    <w:lvl w:ilvl="8" w:tentative="1">
+      <w:start w:val="1"/>
+      <w:numFmt w:val="bullet"/>
+      <w:lvlText w:val=""/>
+      <w:lvlJc w:val="left"/>
+      <w:pPr>
+        <w:tabs>
+          <w:tab w:val="num" w:pos="6480"/>
+        </w:tabs>
+        <w:ind w:left="6480" w:hanging="360"/>
+      </w:pPr>
+      <w:rPr>
+        <w:rFonts w:ascii="Symbol" w:hAnsi="Symbol" w:hint="default"/>
+        <w:sz w:val="20"/>
+      </w:rPr>
     </w:lvl>
   </w:abstractNum>
   <w:num w:numId="1" w16cid:durableId="633367664">
     <w:abstractNumId w:val="1"/>
   </w:num>
   <w:num w:numId="2" w16cid:durableId="24909680">
-    <w:abstractNumId w:val="13"/>
+    <w:abstractNumId w:val="15"/>
   </w:num>
   <w:num w:numId="3" w16cid:durableId="722600958">
     <w:abstractNumId w:val="10"/>
@@ -4539,25 +6435,25 @@
     <w:abstractNumId w:val="8"/>
   </w:num>
   <w:num w:numId="5" w16cid:durableId="1169180458">
-    <w:abstractNumId w:val="14"/>
+    <w:abstractNumId w:val="16"/>
   </w:num>
   <w:num w:numId="6" w16cid:durableId="1702513617">
-    <w:abstractNumId w:val="11"/>
+    <w:abstractNumId w:val="12"/>
   </w:num>
   <w:num w:numId="7" w16cid:durableId="1303464509">
     <w:abstractNumId w:val="7"/>
   </w:num>
   <w:num w:numId="8" w16cid:durableId="540478917">
-    <w:abstractNumId w:val="16"/>
+    <w:abstractNumId w:val="20"/>
   </w:num>
   <w:num w:numId="9" w16cid:durableId="366611389">
-    <w:abstractNumId w:val="12"/>
+    <w:abstractNumId w:val="13"/>
   </w:num>
   <w:num w:numId="10" w16cid:durableId="2077698150">
     <w:abstractNumId w:val="5"/>
   </w:num>
   <w:num w:numId="11" w16cid:durableId="476529804">
-    <w:abstractNumId w:val="15"/>
+    <w:abstractNumId w:val="19"/>
   </w:num>
   <w:num w:numId="12" w16cid:durableId="900218113">
     <w:abstractNumId w:val="0"/>
@@ -4576,6 +6472,24 @@
   </w:num>
   <w:num w:numId="17" w16cid:durableId="1066026372">
     <w:abstractNumId w:val="2"/>
+  </w:num>
+  <w:num w:numId="18" w16cid:durableId="1670135816">
+    <w:abstractNumId w:val="14"/>
+  </w:num>
+  <w:num w:numId="19" w16cid:durableId="1154369424">
+    <w:abstractNumId w:val="17"/>
+  </w:num>
+  <w:num w:numId="20" w16cid:durableId="875502133">
+    <w:abstractNumId w:val="11"/>
+  </w:num>
+  <w:num w:numId="21" w16cid:durableId="104542738">
+    <w:abstractNumId w:val="22"/>
+  </w:num>
+  <w:num w:numId="22" w16cid:durableId="350491898">
+    <w:abstractNumId w:val="21"/>
+  </w:num>
+  <w:num w:numId="23" w16cid:durableId="1498961741">
+    <w:abstractNumId w:val="18"/>
   </w:num>
 </w:numbering>
 </file>
@@ -5023,6 +6937,29 @@
       <w:szCs w:val="26"/>
     </w:rPr>
   </w:style>
+  <w:style w:type="paragraph" w:styleId="Heading3">
+    <w:name w:val="heading 3"/>
+    <w:basedOn w:val="Normal"/>
+    <w:next w:val="Normal"/>
+    <w:link w:val="Heading3Char"/>
+    <w:uiPriority w:val="9"/>
+    <w:semiHidden/>
+    <w:unhideWhenUsed/>
+    <w:qFormat/>
+    <w:rsid w:val="005613C9"/>
+    <w:pPr>
+      <w:keepNext/>
+      <w:keepLines/>
+      <w:spacing w:before="40" w:after="0"/>
+      <w:outlineLvl w:val="2"/>
+    </w:pPr>
+    <w:rPr>
+      <w:rFonts w:asciiTheme="majorHAnsi" w:eastAsiaTheme="majorEastAsia" w:hAnsiTheme="majorHAnsi" w:cstheme="majorBidi"/>
+      <w:color w:val="1F3763" w:themeColor="accent1" w:themeShade="7F"/>
+      <w:sz w:val="24"/>
+      <w:szCs w:val="24"/>
+    </w:rPr>
+  </w:style>
   <w:style w:type="character" w:default="1" w:styleId="DefaultParagraphFont">
     <w:name w:val="Default Paragraph Font"/>
     <w:uiPriority w:val="1"/>
@@ -5129,6 +7066,20 @@
     <w:link w:val="Footer"/>
     <w:uiPriority w:val="99"/>
     <w:rsid w:val="00443E2B"/>
+  </w:style>
+  <w:style w:type="character" w:customStyle="1" w:styleId="Heading3Char">
+    <w:name w:val="Heading 3 Char"/>
+    <w:basedOn w:val="DefaultParagraphFont"/>
+    <w:link w:val="Heading3"/>
+    <w:uiPriority w:val="9"/>
+    <w:semiHidden/>
+    <w:rsid w:val="005613C9"/>
+    <w:rPr>
+      <w:rFonts w:asciiTheme="majorHAnsi" w:eastAsiaTheme="majorEastAsia" w:hAnsiTheme="majorHAnsi" w:cstheme="majorBidi"/>
+      <w:color w:val="1F3763" w:themeColor="accent1" w:themeShade="7F"/>
+      <w:sz w:val="24"/>
+      <w:szCs w:val="24"/>
+    </w:rPr>
   </w:style>
 </w:styles>
 </file>

</xml_diff>